<commit_message>
Update research documents and questionnaire
</commit_message>
<xml_diff>
--- a/research/User Research.docx
+++ b/research/User Research.docx
@@ -50,7 +50,6 @@
         <w:t>The findings from this research will guide the design of a user-centered mobile application that improves queue management, reduces waiting time, enhances transparency, and provides a better overall user experience.</w:t>
       </w:r>
     </w:p>
-    <w:p/>
     <w:p>
       <w:pPr>
         <w:pStyle w:val="2"/>
@@ -124,8 +123,106 @@
         <w:suppressLineNumbers w:val="0"/>
       </w:pPr>
       <w:r>
-        <w:t>The collected responses were analyzed using descriptive statistics generated by Google Forms, including percentages and response frequencies. The results were then examined to identify recurring themes, user needs, and opportunities fo</w:t>
-      </w:r>
+        <w:t>The collected responses were analyzed using descriptive statistics generated by Google Forms, including percentages and response frequencies. The results were then examined to identify recurring themes, user needs, and opportunities for improving the queueing experience through a mobile application.</w:t>
+      </w:r>
+    </w:p>
+    <w:p>
+      <w:pPr>
+        <w:pStyle w:val="9"/>
+        <w:keepNext w:val="0"/>
+        <w:keepLines w:val="0"/>
+        <w:widowControl/>
+        <w:suppressLineNumbers w:val="0"/>
+      </w:pPr>
+    </w:p>
+    <w:p>
+      <w:pPr>
+        <w:pStyle w:val="9"/>
+        <w:keepNext w:val="0"/>
+        <w:keepLines w:val="0"/>
+        <w:widowControl/>
+        <w:suppressLineNumbers w:val="0"/>
+      </w:pPr>
+    </w:p>
+    <w:p>
+      <w:pPr>
+        <w:pStyle w:val="9"/>
+        <w:keepNext w:val="0"/>
+        <w:keepLines w:val="0"/>
+        <w:widowControl/>
+        <w:suppressLineNumbers w:val="0"/>
+      </w:pPr>
+    </w:p>
+    <w:p>
+      <w:pPr>
+        <w:pStyle w:val="9"/>
+        <w:keepNext w:val="0"/>
+        <w:keepLines w:val="0"/>
+        <w:widowControl/>
+        <w:suppressLineNumbers w:val="0"/>
+      </w:pPr>
+    </w:p>
+    <w:p>
+      <w:pPr>
+        <w:pStyle w:val="9"/>
+        <w:keepNext w:val="0"/>
+        <w:keepLines w:val="0"/>
+        <w:widowControl/>
+        <w:suppressLineNumbers w:val="0"/>
+      </w:pPr>
+    </w:p>
+    <w:p>
+      <w:pPr>
+        <w:pStyle w:val="9"/>
+        <w:keepNext w:val="0"/>
+        <w:keepLines w:val="0"/>
+        <w:widowControl/>
+        <w:suppressLineNumbers w:val="0"/>
+      </w:pPr>
+    </w:p>
+    <w:p>
+      <w:pPr>
+        <w:pStyle w:val="9"/>
+        <w:keepNext w:val="0"/>
+        <w:keepLines w:val="0"/>
+        <w:widowControl/>
+        <w:suppressLineNumbers w:val="0"/>
+      </w:pPr>
+    </w:p>
+    <w:p>
+      <w:pPr>
+        <w:pStyle w:val="9"/>
+        <w:keepNext w:val="0"/>
+        <w:keepLines w:val="0"/>
+        <w:widowControl/>
+        <w:suppressLineNumbers w:val="0"/>
+        <w:rPr>
+          <w:rFonts w:hint="default"/>
+          <w:lang w:val="en-US"/>
+        </w:rPr>
+      </w:pPr>
+    </w:p>
+    <w:p>
+      <w:pPr>
+        <w:pStyle w:val="9"/>
+        <w:keepNext w:val="0"/>
+        <w:keepLines w:val="0"/>
+        <w:widowControl/>
+        <w:suppressLineNumbers w:val="0"/>
+        <w:rPr>
+          <w:rFonts w:hint="default"/>
+          <w:lang w:val="en-US"/>
+        </w:rPr>
+      </w:pPr>
+    </w:p>
+    <w:p>
+      <w:pPr>
+        <w:pStyle w:val="9"/>
+        <w:keepNext w:val="0"/>
+        <w:keepLines w:val="0"/>
+        <w:widowControl/>
+        <w:suppressLineNumbers w:val="0"/>
+      </w:pPr>
       <w:r>
         <w:drawing>
           <wp:inline distT="0" distB="0" distL="114300" distR="114300">
@@ -169,13 +266,14 @@
           </wp:inline>
         </w:drawing>
       </w:r>
-      <w:r>
-        <w:t>r improving the queueing experience through a mobile application.</w:t>
-      </w:r>
-    </w:p>
-    <w:p/>
-    <w:p>
-      <w:pPr>
+    </w:p>
+    <w:p>
+      <w:pPr>
+        <w:pStyle w:val="9"/>
+        <w:keepNext w:val="0"/>
+        <w:keepLines w:val="0"/>
+        <w:widowControl/>
+        <w:suppressLineNumbers w:val="0"/>
         <w:rPr>
           <w:rFonts w:hint="default"/>
           <w:lang w:val="en-US"/>
@@ -186,9 +284,10 @@
           <w:rFonts w:hint="default"/>
           <w:lang w:val="en-US"/>
         </w:rPr>
-        <w:t xml:space="preserve">OUR GOOGLE FORM </w:t>
-      </w:r>
-    </w:p>
+        <w:t>OUR GOOGLE FORM</w:t>
+      </w:r>
+    </w:p>
+    <w:p/>
     <w:p>
       <w:pPr>
         <w:rPr>
@@ -233,6 +332,7 @@
     </w:p>
     <w:tbl>
       <w:tblPr>
+        <w:tblStyle w:val="6"/>
         <w:tblW w:w="0" w:type="auto"/>
         <w:tblCellSpacing w:w="15" w:type="dxa"/>
         <w:tblInd w:w="0" w:type="dxa"/>
@@ -244,7 +344,7 @@
           <w:insideH w:val="none" w:color="auto" w:sz="0" w:space="0"/>
           <w:insideV w:val="none" w:color="auto" w:sz="0" w:space="0"/>
         </w:tblBorders>
-        <w:shd w:val="clear"/>
+        <w:shd w:val="clear" w:color="auto" w:fill="auto"/>
         <w:tblLayout w:type="autofit"/>
         <w:tblCellMar>
           <w:top w:w="15" w:type="dxa"/>
@@ -268,7 +368,7 @@
             <w:insideH w:val="none" w:color="auto" w:sz="0" w:space="0"/>
             <w:insideV w:val="none" w:color="auto" w:sz="0" w:space="0"/>
           </w:tblBorders>
-          <w:shd w:val="clear"/>
+          <w:shd w:val="clear" w:color="auto" w:fill="auto"/>
           <w:tblCellMar>
             <w:top w:w="15" w:type="dxa"/>
             <w:left w:w="15" w:type="dxa"/>
@@ -283,7 +383,7 @@
         <w:tc>
           <w:tcPr>
             <w:tcW w:w="0" w:type="auto"/>
-            <w:shd w:val="clear"/>
+            <w:shd w:val="clear" w:color="auto" w:fill="auto"/>
             <w:vAlign w:val="center"/>
           </w:tcPr>
           <w:p>
@@ -315,7 +415,7 @@
         <w:tc>
           <w:tcPr>
             <w:tcW w:w="0" w:type="auto"/>
-            <w:shd w:val="clear"/>
+            <w:shd w:val="clear" w:color="auto" w:fill="auto"/>
             <w:vAlign w:val="center"/>
           </w:tcPr>
           <w:p>
@@ -347,7 +447,7 @@
         <w:tc>
           <w:tcPr>
             <w:tcW w:w="0" w:type="auto"/>
-            <w:shd w:val="clear"/>
+            <w:shd w:val="clear" w:color="auto" w:fill="auto"/>
             <w:vAlign w:val="center"/>
           </w:tcPr>
           <w:p>
@@ -387,7 +487,6 @@
             <w:insideH w:val="none" w:color="auto" w:sz="0" w:space="0"/>
             <w:insideV w:val="none" w:color="auto" w:sz="0" w:space="0"/>
           </w:tblBorders>
-          <w:shd w:val="clear"/>
           <w:tblCellMar>
             <w:top w:w="15" w:type="dxa"/>
             <w:left w:w="15" w:type="dxa"/>
@@ -401,7 +500,7 @@
         <w:tc>
           <w:tcPr>
             <w:tcW w:w="0" w:type="auto"/>
-            <w:shd w:val="clear"/>
+            <w:shd w:val="clear" w:color="auto" w:fill="auto"/>
             <w:vAlign w:val="center"/>
           </w:tcPr>
           <w:p>
@@ -427,7 +526,7 @@
         <w:tc>
           <w:tcPr>
             <w:tcW w:w="0" w:type="auto"/>
-            <w:shd w:val="clear"/>
+            <w:shd w:val="clear" w:color="auto" w:fill="auto"/>
             <w:vAlign w:val="center"/>
           </w:tcPr>
           <w:p>
@@ -453,7 +552,7 @@
         <w:tc>
           <w:tcPr>
             <w:tcW w:w="0" w:type="auto"/>
-            <w:shd w:val="clear"/>
+            <w:shd w:val="clear" w:color="auto" w:fill="auto"/>
             <w:vAlign w:val="center"/>
           </w:tcPr>
           <w:p>
@@ -487,7 +586,7 @@
             <w:insideH w:val="none" w:color="auto" w:sz="0" w:space="0"/>
             <w:insideV w:val="none" w:color="auto" w:sz="0" w:space="0"/>
           </w:tblBorders>
-          <w:shd w:val="clear"/>
+          <w:shd w:val="clear" w:color="auto" w:fill="auto"/>
           <w:tblCellMar>
             <w:top w:w="15" w:type="dxa"/>
             <w:left w:w="15" w:type="dxa"/>
@@ -501,7 +600,7 @@
         <w:tc>
           <w:tcPr>
             <w:tcW w:w="0" w:type="auto"/>
-            <w:shd w:val="clear"/>
+            <w:shd w:val="clear" w:color="auto" w:fill="auto"/>
             <w:vAlign w:val="center"/>
           </w:tcPr>
           <w:p>
@@ -527,7 +626,7 @@
         <w:tc>
           <w:tcPr>
             <w:tcW w:w="0" w:type="auto"/>
-            <w:shd w:val="clear"/>
+            <w:shd w:val="clear" w:color="auto" w:fill="auto"/>
             <w:vAlign w:val="center"/>
           </w:tcPr>
           <w:p>
@@ -553,7 +652,7 @@
         <w:tc>
           <w:tcPr>
             <w:tcW w:w="0" w:type="auto"/>
-            <w:shd w:val="clear"/>
+            <w:shd w:val="clear" w:color="auto" w:fill="auto"/>
             <w:vAlign w:val="center"/>
           </w:tcPr>
           <w:p>
@@ -587,7 +686,7 @@
             <w:insideH w:val="none" w:color="auto" w:sz="0" w:space="0"/>
             <w:insideV w:val="none" w:color="auto" w:sz="0" w:space="0"/>
           </w:tblBorders>
-          <w:shd w:val="clear"/>
+          <w:shd w:val="clear" w:color="auto" w:fill="auto"/>
           <w:tblCellMar>
             <w:top w:w="15" w:type="dxa"/>
             <w:left w:w="15" w:type="dxa"/>
@@ -601,7 +700,7 @@
         <w:tc>
           <w:tcPr>
             <w:tcW w:w="0" w:type="auto"/>
-            <w:shd w:val="clear"/>
+            <w:shd w:val="clear" w:color="auto" w:fill="auto"/>
             <w:vAlign w:val="center"/>
           </w:tcPr>
           <w:p>
@@ -627,7 +726,7 @@
         <w:tc>
           <w:tcPr>
             <w:tcW w:w="0" w:type="auto"/>
-            <w:shd w:val="clear"/>
+            <w:shd w:val="clear" w:color="auto" w:fill="auto"/>
             <w:vAlign w:val="center"/>
           </w:tcPr>
           <w:p>
@@ -653,7 +752,7 @@
         <w:tc>
           <w:tcPr>
             <w:tcW w:w="0" w:type="auto"/>
-            <w:shd w:val="clear"/>
+            <w:shd w:val="clear" w:color="auto" w:fill="auto"/>
             <w:vAlign w:val="center"/>
           </w:tcPr>
           <w:p>
@@ -687,7 +786,6 @@
             <w:insideH w:val="none" w:color="auto" w:sz="0" w:space="0"/>
             <w:insideV w:val="none" w:color="auto" w:sz="0" w:space="0"/>
           </w:tblBorders>
-          <w:shd w:val="clear"/>
           <w:tblCellMar>
             <w:top w:w="15" w:type="dxa"/>
             <w:left w:w="15" w:type="dxa"/>
@@ -701,7 +799,7 @@
         <w:tc>
           <w:tcPr>
             <w:tcW w:w="0" w:type="auto"/>
-            <w:shd w:val="clear"/>
+            <w:shd w:val="clear" w:color="auto" w:fill="auto"/>
             <w:vAlign w:val="center"/>
           </w:tcPr>
           <w:p>
@@ -727,7 +825,7 @@
         <w:tc>
           <w:tcPr>
             <w:tcW w:w="0" w:type="auto"/>
-            <w:shd w:val="clear"/>
+            <w:shd w:val="clear" w:color="auto" w:fill="auto"/>
             <w:vAlign w:val="center"/>
           </w:tcPr>
           <w:p>
@@ -753,7 +851,7 @@
         <w:tc>
           <w:tcPr>
             <w:tcW w:w="0" w:type="auto"/>
-            <w:shd w:val="clear"/>
+            <w:shd w:val="clear" w:color="auto" w:fill="auto"/>
             <w:vAlign w:val="center"/>
           </w:tcPr>
           <w:p>
@@ -787,7 +885,6 @@
             <w:insideH w:val="none" w:color="auto" w:sz="0" w:space="0"/>
             <w:insideV w:val="none" w:color="auto" w:sz="0" w:space="0"/>
           </w:tblBorders>
-          <w:shd w:val="clear"/>
           <w:tblCellMar>
             <w:top w:w="15" w:type="dxa"/>
             <w:left w:w="15" w:type="dxa"/>
@@ -801,7 +898,7 @@
         <w:tc>
           <w:tcPr>
             <w:tcW w:w="0" w:type="auto"/>
-            <w:shd w:val="clear"/>
+            <w:shd w:val="clear" w:color="auto" w:fill="auto"/>
             <w:vAlign w:val="center"/>
           </w:tcPr>
           <w:p>
@@ -828,7 +925,7 @@
         <w:tc>
           <w:tcPr>
             <w:tcW w:w="0" w:type="auto"/>
-            <w:shd w:val="clear"/>
+            <w:shd w:val="clear" w:color="auto" w:fill="auto"/>
             <w:vAlign w:val="center"/>
           </w:tcPr>
           <w:p>
@@ -855,7 +952,7 @@
         <w:tc>
           <w:tcPr>
             <w:tcW w:w="0" w:type="auto"/>
-            <w:shd w:val="clear"/>
+            <w:shd w:val="clear" w:color="auto" w:fill="auto"/>
             <w:vAlign w:val="center"/>
           </w:tcPr>
           <w:p>
@@ -947,56 +1044,6 @@
           <w:lang w:val="en-US"/>
         </w:rPr>
       </w:pPr>
-      <w:r>
-        <w:rPr>
-          <w:rFonts w:ascii="SimSun" w:hAnsi="SimSun" w:eastAsia="SimSun" w:cs="SimSun"/>
-          <w:b w:val="0"/>
-          <w:bCs w:val="0"/>
-          <w:sz w:val="24"/>
-          <w:szCs w:val="24"/>
-        </w:rPr>
-        <w:drawing>
-          <wp:inline distT="0" distB="0" distL="114300" distR="114300">
-            <wp:extent cx="3420745" cy="1551305"/>
-            <wp:effectExtent l="0" t="0" r="8255" b="3175"/>
-            <wp:docPr id="9" name="Picture 9" descr="IMG_256"/>
-            <wp:cNvGraphicFramePr>
-              <a:graphicFrameLocks xmlns:a="http://schemas.openxmlformats.org/drawingml/2006/main" noChangeAspect="1"/>
-            </wp:cNvGraphicFramePr>
-            <a:graphic xmlns:a="http://schemas.openxmlformats.org/drawingml/2006/main">
-              <a:graphicData uri="http://schemas.openxmlformats.org/drawingml/2006/picture">
-                <pic:pic xmlns:pic="http://schemas.openxmlformats.org/drawingml/2006/picture">
-                  <pic:nvPicPr>
-                    <pic:cNvPr id="9" name="Picture 9" descr="IMG_256"/>
-                    <pic:cNvPicPr>
-                      <a:picLocks noChangeAspect="1"/>
-                    </pic:cNvPicPr>
-                  </pic:nvPicPr>
-                  <pic:blipFill>
-                    <a:blip r:embed="rId8"/>
-                    <a:stretch>
-                      <a:fillRect/>
-                    </a:stretch>
-                  </pic:blipFill>
-                  <pic:spPr>
-                    <a:xfrm>
-                      <a:off x="0" y="0"/>
-                      <a:ext cx="3420745" cy="1551305"/>
-                    </a:xfrm>
-                    <a:prstGeom prst="rect">
-                      <a:avLst/>
-                    </a:prstGeom>
-                    <a:noFill/>
-                    <a:ln w="9525">
-                      <a:noFill/>
-                    </a:ln>
-                  </pic:spPr>
-                </pic:pic>
-              </a:graphicData>
-            </a:graphic>
-          </wp:inline>
-        </w:drawing>
-      </w:r>
     </w:p>
     <w:p>
       <w:pPr>
@@ -1070,7 +1117,7 @@
                     </pic:cNvPicPr>
                   </pic:nvPicPr>
                   <pic:blipFill>
-                    <a:blip r:embed="rId9"/>
+                    <a:blip r:embed="rId8"/>
                     <a:stretch>
                       <a:fillRect/>
                     </a:stretch>
@@ -1118,7 +1165,7 @@
                     </pic:cNvPicPr>
                   </pic:nvPicPr>
                   <pic:blipFill>
-                    <a:blip r:embed="rId9"/>
+                    <a:blip r:embed="rId8"/>
                     <a:stretch>
                       <a:fillRect/>
                     </a:stretch>
@@ -1199,6 +1246,1327 @@
     </w:p>
     <w:p>
       <w:pPr>
+        <w:pStyle w:val="2"/>
+        <w:keepNext w:val="0"/>
+        <w:keepLines w:val="0"/>
+        <w:widowControl/>
+        <w:suppressLineNumbers w:val="0"/>
+      </w:pPr>
+      <w:r>
+        <w:t>Research Findings</w:t>
+      </w:r>
+    </w:p>
+    <w:p>
+      <w:pPr>
+        <w:pStyle w:val="9"/>
+        <w:keepNext w:val="0"/>
+        <w:keepLines w:val="0"/>
+        <w:widowControl/>
+        <w:suppressLineNumbers w:val="0"/>
+      </w:pPr>
+      <w:r>
+        <w:t xml:space="preserve">The questionnaire was completed by </w:t>
+      </w:r>
+      <w:r>
+        <w:rPr>
+          <w:rStyle w:val="10"/>
+        </w:rPr>
+        <w:t>14 participants</w:t>
+      </w:r>
+      <w:r>
+        <w:t xml:space="preserve"> representing different categories of university users. The findings provide valuable insights into users' experiences with existing queue management processes and their expectations for a Virtual Queue Management Mobile Application.</w:t>
+      </w:r>
+    </w:p>
+    <w:p>
+      <w:pPr>
+        <w:pStyle w:val="3"/>
+        <w:keepNext w:val="0"/>
+        <w:keepLines w:val="0"/>
+        <w:widowControl/>
+        <w:suppressLineNumbers w:val="0"/>
+      </w:pPr>
+      <w:r>
+        <w:t>1. Participant Demographics</w:t>
+      </w:r>
+    </w:p>
+    <w:p>
+      <w:pPr>
+        <w:pStyle w:val="9"/>
+        <w:keepNext w:val="0"/>
+        <w:keepLines w:val="0"/>
+        <w:widowControl/>
+        <w:suppressLineNumbers w:val="0"/>
+      </w:pPr>
+      <w:r>
+        <w:t xml:space="preserve">The majority of respondents were </w:t>
+      </w:r>
+      <w:r>
+        <w:rPr>
+          <w:rStyle w:val="10"/>
+        </w:rPr>
+        <w:t>students (64.3%)</w:t>
+      </w:r>
+      <w:r>
+        <w:t xml:space="preserve">, followed by </w:t>
+      </w:r>
+      <w:r>
+        <w:rPr>
+          <w:rStyle w:val="10"/>
+        </w:rPr>
+        <w:t>non-teaching staff (21.4%)</w:t>
+      </w:r>
+      <w:r>
+        <w:t xml:space="preserve">, while </w:t>
+      </w:r>
+      <w:r>
+        <w:rPr>
+          <w:rStyle w:val="10"/>
+        </w:rPr>
+        <w:t>teaching staff</w:t>
+      </w:r>
+      <w:r>
+        <w:t xml:space="preserve"> and </w:t>
+      </w:r>
+      <w:r>
+        <w:rPr>
+          <w:rStyle w:val="10"/>
+        </w:rPr>
+        <w:t>visitors</w:t>
+      </w:r>
+      <w:r>
+        <w:t xml:space="preserve"> each accounted for </w:t>
+      </w:r>
+      <w:r>
+        <w:rPr>
+          <w:rStyle w:val="10"/>
+        </w:rPr>
+        <w:t>7.1%</w:t>
+      </w:r>
+      <w:r>
+        <w:t xml:space="preserve"> of the participants. Since students make up the largest user group, the findings strongly reflect the experiences of the application's primary target users.</w:t>
+      </w:r>
+    </w:p>
+    <w:p>
+      <w:pPr>
+        <w:pStyle w:val="9"/>
+        <w:keepNext w:val="0"/>
+        <w:keepLines w:val="0"/>
+        <w:widowControl/>
+        <w:suppressLineNumbers w:val="0"/>
+      </w:pPr>
+      <w:r>
+        <w:rPr>
+          <w:rStyle w:val="10"/>
+        </w:rPr>
+        <w:t>Finding:</w:t>
+      </w:r>
+      <w:r>
+        <w:t xml:space="preserve"> Students are the primary users of university service points and are therefore the group most affected by long queues.</w:t>
+      </w:r>
+    </w:p>
+    <w:p>
+      <w:pPr>
+        <w:keepNext w:val="0"/>
+        <w:keepLines w:val="0"/>
+        <w:widowControl/>
+        <w:suppressLineNumbers w:val="0"/>
+      </w:pPr>
+      <w:r>
+        <w:pict>
+          <v:rect id="_x0000_i1025" o:spt="1" style="height:1.5pt;width:432pt;" fillcolor="#A0A0A0" filled="t" stroked="f" coordsize="21600,21600" o:hr="t" o:hrstd="t" o:hralign="center">
+            <v:path/>
+            <v:fill on="t" focussize="0,0"/>
+            <v:stroke on="f"/>
+            <v:imagedata o:title=""/>
+            <o:lock v:ext="edit"/>
+            <w10:wrap type="none"/>
+            <w10:anchorlock/>
+          </v:rect>
+        </w:pict>
+      </w:r>
+    </w:p>
+    <w:p>
+      <w:pPr>
+        <w:pStyle w:val="3"/>
+        <w:keepNext w:val="0"/>
+        <w:keepLines w:val="0"/>
+        <w:widowControl/>
+        <w:suppressLineNumbers w:val="0"/>
+      </w:pPr>
+      <w:r>
+        <w:t>2. Frequency of Visiting University Service Points</w:t>
+      </w:r>
+    </w:p>
+    <w:p>
+      <w:pPr>
+        <w:pStyle w:val="9"/>
+        <w:keepNext w:val="0"/>
+        <w:keepLines w:val="0"/>
+        <w:widowControl/>
+        <w:suppressLineNumbers w:val="0"/>
+      </w:pPr>
+      <w:r>
+        <w:t>Participants were asked how often they visit university service points such as the Registry, Finance Office, Clinic, and Accommodation Office.</w:t>
+      </w:r>
+    </w:p>
+    <w:p>
+      <w:pPr>
+        <w:pStyle w:val="9"/>
+        <w:keepNext w:val="0"/>
+        <w:keepLines w:val="0"/>
+        <w:widowControl/>
+        <w:suppressLineNumbers w:val="0"/>
+      </w:pPr>
+      <w:r>
+        <w:t>The responses showed that:</w:t>
+      </w:r>
+    </w:p>
+    <w:p>
+      <w:pPr>
+        <w:keepNext w:val="0"/>
+        <w:keepLines w:val="0"/>
+        <w:widowControl/>
+        <w:numPr>
+          <w:ilvl w:val="0"/>
+          <w:numId w:val="1"/>
+        </w:numPr>
+        <w:suppressLineNumbers w:val="0"/>
+        <w:spacing w:before="0" w:beforeAutospacing="1" w:after="0" w:afterAutospacing="1"/>
+        <w:ind w:left="720" w:hanging="360"/>
+      </w:pPr>
+      <w:r>
+        <w:rPr>
+          <w:rStyle w:val="10"/>
+        </w:rPr>
+        <w:t>28.6%</w:t>
+      </w:r>
+      <w:r>
+        <w:t xml:space="preserve"> visit service points </w:t>
+      </w:r>
+      <w:r>
+        <w:rPr>
+          <w:rStyle w:val="10"/>
+        </w:rPr>
+        <w:t>daily</w:t>
+      </w:r>
+      <w:r>
+        <w:t xml:space="preserve">. </w:t>
+      </w:r>
+    </w:p>
+    <w:p>
+      <w:pPr>
+        <w:keepNext w:val="0"/>
+        <w:keepLines w:val="0"/>
+        <w:widowControl/>
+        <w:numPr>
+          <w:ilvl w:val="0"/>
+          <w:numId w:val="1"/>
+        </w:numPr>
+        <w:suppressLineNumbers w:val="0"/>
+        <w:spacing w:before="0" w:beforeAutospacing="1" w:after="0" w:afterAutospacing="1"/>
+        <w:ind w:left="720" w:hanging="360"/>
+      </w:pPr>
+      <w:r>
+        <w:rPr>
+          <w:rStyle w:val="10"/>
+        </w:rPr>
+        <w:t>28.6%</w:t>
+      </w:r>
+      <w:r>
+        <w:t xml:space="preserve"> visit </w:t>
+      </w:r>
+      <w:r>
+        <w:rPr>
+          <w:rStyle w:val="10"/>
+        </w:rPr>
+        <w:t>2–3 times per week</w:t>
+      </w:r>
+      <w:r>
+        <w:t xml:space="preserve">. </w:t>
+      </w:r>
+    </w:p>
+    <w:p>
+      <w:pPr>
+        <w:keepNext w:val="0"/>
+        <w:keepLines w:val="0"/>
+        <w:widowControl/>
+        <w:numPr>
+          <w:ilvl w:val="0"/>
+          <w:numId w:val="1"/>
+        </w:numPr>
+        <w:suppressLineNumbers w:val="0"/>
+        <w:spacing w:before="0" w:beforeAutospacing="1" w:after="0" w:afterAutospacing="1"/>
+        <w:ind w:left="720" w:hanging="360"/>
+      </w:pPr>
+      <w:r>
+        <w:rPr>
+          <w:rStyle w:val="10"/>
+        </w:rPr>
+        <w:t>28.6%</w:t>
+      </w:r>
+      <w:r>
+        <w:t xml:space="preserve"> visit </w:t>
+      </w:r>
+      <w:r>
+        <w:rPr>
+          <w:rStyle w:val="10"/>
+        </w:rPr>
+        <w:t>rarely</w:t>
+      </w:r>
+      <w:r>
+        <w:t xml:space="preserve">. </w:t>
+      </w:r>
+    </w:p>
+    <w:p>
+      <w:pPr>
+        <w:keepNext w:val="0"/>
+        <w:keepLines w:val="0"/>
+        <w:widowControl/>
+        <w:numPr>
+          <w:ilvl w:val="0"/>
+          <w:numId w:val="1"/>
+        </w:numPr>
+        <w:suppressLineNumbers w:val="0"/>
+        <w:spacing w:before="0" w:beforeAutospacing="1" w:after="0" w:afterAutospacing="1"/>
+        <w:ind w:left="720" w:hanging="360"/>
+      </w:pPr>
+      <w:r>
+        <w:rPr>
+          <w:rStyle w:val="10"/>
+        </w:rPr>
+        <w:t>14.3%</w:t>
+      </w:r>
+      <w:r>
+        <w:t xml:space="preserve"> visit </w:t>
+      </w:r>
+      <w:r>
+        <w:rPr>
+          <w:rStyle w:val="10"/>
+        </w:rPr>
+        <w:t>occasionally (monthly)</w:t>
+      </w:r>
+      <w:r>
+        <w:t xml:space="preserve">. </w:t>
+      </w:r>
+    </w:p>
+    <w:p>
+      <w:pPr>
+        <w:pStyle w:val="9"/>
+        <w:keepNext w:val="0"/>
+        <w:keepLines w:val="0"/>
+        <w:widowControl/>
+        <w:suppressLineNumbers w:val="0"/>
+      </w:pPr>
+      <w:r>
+        <w:rPr>
+          <w:rStyle w:val="10"/>
+        </w:rPr>
+        <w:t>Finding:</w:t>
+      </w:r>
+      <w:r>
+        <w:t xml:space="preserve"> More than half of the respondents use university service points regularly, indicating that an efficient queue management system would benefit many users.</w:t>
+      </w:r>
+    </w:p>
+    <w:p>
+      <w:pPr>
+        <w:keepNext w:val="0"/>
+        <w:keepLines w:val="0"/>
+        <w:widowControl/>
+        <w:suppressLineNumbers w:val="0"/>
+      </w:pPr>
+      <w:r>
+        <w:pict>
+          <v:rect id="_x0000_i1026" o:spt="1" style="height:1.5pt;width:432pt;" fillcolor="#A0A0A0" filled="t" stroked="f" coordsize="21600,21600" o:hr="t" o:hrstd="t" o:hralign="center">
+            <v:path/>
+            <v:fill on="t" focussize="0,0"/>
+            <v:stroke on="f"/>
+            <v:imagedata o:title=""/>
+            <o:lock v:ext="edit"/>
+            <w10:wrap type="none"/>
+            <w10:anchorlock/>
+          </v:rect>
+        </w:pict>
+      </w:r>
+    </w:p>
+    <w:p>
+      <w:pPr>
+        <w:pStyle w:val="3"/>
+        <w:keepNext w:val="0"/>
+        <w:keepLines w:val="0"/>
+        <w:widowControl/>
+        <w:suppressLineNumbers w:val="0"/>
+      </w:pPr>
+      <w:r>
+        <w:t>3. Service Points Where Users Experience Queues</w:t>
+      </w:r>
+    </w:p>
+    <w:p>
+      <w:pPr>
+        <w:pStyle w:val="9"/>
+        <w:keepNext w:val="0"/>
+        <w:keepLines w:val="0"/>
+        <w:widowControl/>
+        <w:suppressLineNumbers w:val="0"/>
+      </w:pPr>
+      <w:r>
+        <w:t>Participants selected the service points where they had experienced queues.</w:t>
+      </w:r>
+    </w:p>
+    <w:p>
+      <w:pPr>
+        <w:pStyle w:val="9"/>
+        <w:keepNext w:val="0"/>
+        <w:keepLines w:val="0"/>
+        <w:widowControl/>
+        <w:suppressLineNumbers w:val="0"/>
+      </w:pPr>
+      <w:r>
+        <w:t xml:space="preserve">The </w:t>
+      </w:r>
+      <w:r>
+        <w:rPr>
+          <w:rStyle w:val="10"/>
+        </w:rPr>
+        <w:t>Finance Office</w:t>
+      </w:r>
+      <w:r>
+        <w:t xml:space="preserve"> recorded the highest number of responses (</w:t>
+      </w:r>
+      <w:r>
+        <w:rPr>
+          <w:rStyle w:val="10"/>
+        </w:rPr>
+        <w:t>64.3%</w:t>
+      </w:r>
+      <w:r>
+        <w:t xml:space="preserve">), followed by the </w:t>
+      </w:r>
+      <w:r>
+        <w:rPr>
+          <w:rStyle w:val="10"/>
+        </w:rPr>
+        <w:t>Food's Mess (57.1%)</w:t>
+      </w:r>
+      <w:r>
+        <w:t xml:space="preserve"> and the </w:t>
+      </w:r>
+      <w:r>
+        <w:rPr>
+          <w:rStyle w:val="10"/>
+        </w:rPr>
+        <w:t>Accommodation Office (35.7%)</w:t>
+      </w:r>
+      <w:r>
+        <w:t xml:space="preserve">. The Registry, Clinic, and Welfare Office each received </w:t>
+      </w:r>
+      <w:r>
+        <w:rPr>
+          <w:rStyle w:val="10"/>
+        </w:rPr>
+        <w:t>28.6%</w:t>
+      </w:r>
+      <w:r>
+        <w:t>, while the Sports and Games Office had the lowest response (</w:t>
+      </w:r>
+      <w:r>
+        <w:rPr>
+          <w:rStyle w:val="10"/>
+        </w:rPr>
+        <w:t>7.1%</w:t>
+      </w:r>
+      <w:r>
+        <w:t>).</w:t>
+      </w:r>
+    </w:p>
+    <w:p>
+      <w:pPr>
+        <w:pStyle w:val="9"/>
+        <w:keepNext w:val="0"/>
+        <w:keepLines w:val="0"/>
+        <w:widowControl/>
+        <w:suppressLineNumbers w:val="0"/>
+      </w:pPr>
+      <w:r>
+        <w:rPr>
+          <w:rStyle w:val="10"/>
+        </w:rPr>
+        <w:t>Finding:</w:t>
+      </w:r>
+      <w:r>
+        <w:t xml:space="preserve"> Queueing is experienced across multiple university service points, with the Finance Office and Food's Mess being the busiest locations.</w:t>
+      </w:r>
+    </w:p>
+    <w:p>
+      <w:pPr>
+        <w:keepNext w:val="0"/>
+        <w:keepLines w:val="0"/>
+        <w:widowControl/>
+        <w:suppressLineNumbers w:val="0"/>
+      </w:pPr>
+      <w:r>
+        <w:pict>
+          <v:rect id="_x0000_i1027" o:spt="1" style="height:1.5pt;width:432pt;" fillcolor="#A0A0A0" filled="t" stroked="f" coordsize="21600,21600" o:hr="t" o:hrstd="t" o:hralign="center">
+            <v:path/>
+            <v:fill on="t" focussize="0,0"/>
+            <v:stroke on="f"/>
+            <v:imagedata o:title=""/>
+            <o:lock v:ext="edit"/>
+            <w10:wrap type="none"/>
+            <w10:anchorlock/>
+          </v:rect>
+        </w:pict>
+      </w:r>
+    </w:p>
+    <w:p>
+      <w:pPr>
+        <w:pStyle w:val="3"/>
+        <w:keepNext w:val="0"/>
+        <w:keepLines w:val="0"/>
+        <w:widowControl/>
+        <w:suppressLineNumbers w:val="0"/>
+      </w:pPr>
+      <w:r>
+        <w:t>4. Experience with Long Waiting Times</w:t>
+      </w:r>
+    </w:p>
+    <w:p>
+      <w:pPr>
+        <w:pStyle w:val="9"/>
+        <w:keepNext w:val="0"/>
+        <w:keepLines w:val="0"/>
+        <w:widowControl/>
+        <w:suppressLineNumbers w:val="0"/>
+      </w:pPr>
+      <w:r>
+        <w:t>Participants were asked how often they experience long queues at university service points.</w:t>
+      </w:r>
+    </w:p>
+    <w:p>
+      <w:pPr>
+        <w:pStyle w:val="9"/>
+        <w:keepNext w:val="0"/>
+        <w:keepLines w:val="0"/>
+        <w:widowControl/>
+        <w:suppressLineNumbers w:val="0"/>
+      </w:pPr>
+      <w:r>
+        <w:t>The results showed that:</w:t>
+      </w:r>
+    </w:p>
+    <w:p>
+      <w:pPr>
+        <w:keepNext w:val="0"/>
+        <w:keepLines w:val="0"/>
+        <w:widowControl/>
+        <w:numPr>
+          <w:ilvl w:val="0"/>
+          <w:numId w:val="2"/>
+        </w:numPr>
+        <w:suppressLineNumbers w:val="0"/>
+        <w:spacing w:before="0" w:beforeAutospacing="1" w:after="0" w:afterAutospacing="1"/>
+        <w:ind w:left="720" w:hanging="360"/>
+      </w:pPr>
+      <w:r>
+        <w:rPr>
+          <w:rStyle w:val="10"/>
+        </w:rPr>
+        <w:t>42.9%</w:t>
+      </w:r>
+      <w:r>
+        <w:t xml:space="preserve"> experience long queues </w:t>
+      </w:r>
+      <w:r>
+        <w:rPr>
+          <w:rStyle w:val="10"/>
+        </w:rPr>
+        <w:t>occasionally</w:t>
+      </w:r>
+      <w:r>
+        <w:t xml:space="preserve">. </w:t>
+      </w:r>
+    </w:p>
+    <w:p>
+      <w:pPr>
+        <w:keepNext w:val="0"/>
+        <w:keepLines w:val="0"/>
+        <w:widowControl/>
+        <w:numPr>
+          <w:ilvl w:val="0"/>
+          <w:numId w:val="2"/>
+        </w:numPr>
+        <w:suppressLineNumbers w:val="0"/>
+        <w:spacing w:before="0" w:beforeAutospacing="1" w:after="0" w:afterAutospacing="1"/>
+        <w:ind w:left="720" w:hanging="360"/>
+      </w:pPr>
+      <w:r>
+        <w:rPr>
+          <w:rStyle w:val="10"/>
+        </w:rPr>
+        <w:t>28.6%</w:t>
+      </w:r>
+      <w:r>
+        <w:t xml:space="preserve"> experience them </w:t>
+      </w:r>
+      <w:r>
+        <w:rPr>
+          <w:rStyle w:val="10"/>
+        </w:rPr>
+        <w:t>frequently</w:t>
+      </w:r>
+      <w:r>
+        <w:t xml:space="preserve">. </w:t>
+      </w:r>
+    </w:p>
+    <w:p>
+      <w:pPr>
+        <w:keepNext w:val="0"/>
+        <w:keepLines w:val="0"/>
+        <w:widowControl/>
+        <w:numPr>
+          <w:ilvl w:val="0"/>
+          <w:numId w:val="2"/>
+        </w:numPr>
+        <w:suppressLineNumbers w:val="0"/>
+        <w:spacing w:before="0" w:beforeAutospacing="1" w:after="0" w:afterAutospacing="1"/>
+        <w:ind w:left="720" w:hanging="360"/>
+      </w:pPr>
+      <w:r>
+        <w:rPr>
+          <w:rStyle w:val="10"/>
+        </w:rPr>
+        <w:t>28.6%</w:t>
+      </w:r>
+      <w:r>
+        <w:t xml:space="preserve"> experience them </w:t>
+      </w:r>
+      <w:r>
+        <w:rPr>
+          <w:rStyle w:val="10"/>
+        </w:rPr>
+        <w:t>very rarely</w:t>
+      </w:r>
+      <w:r>
+        <w:t xml:space="preserve">. </w:t>
+      </w:r>
+    </w:p>
+    <w:p>
+      <w:pPr>
+        <w:keepNext w:val="0"/>
+        <w:keepLines w:val="0"/>
+        <w:widowControl/>
+        <w:numPr>
+          <w:ilvl w:val="0"/>
+          <w:numId w:val="2"/>
+        </w:numPr>
+        <w:suppressLineNumbers w:val="0"/>
+        <w:spacing w:before="0" w:beforeAutospacing="1" w:after="0" w:afterAutospacing="1"/>
+        <w:ind w:left="720" w:hanging="360"/>
+      </w:pPr>
+      <w:r>
+        <w:rPr>
+          <w:rStyle w:val="10"/>
+        </w:rPr>
+        <w:t>0%</w:t>
+      </w:r>
+      <w:r>
+        <w:t xml:space="preserve"> selected </w:t>
+      </w:r>
+      <w:r>
+        <w:rPr>
+          <w:rStyle w:val="10"/>
+        </w:rPr>
+        <w:t>Never</w:t>
+      </w:r>
+      <w:r>
+        <w:t xml:space="preserve">. </w:t>
+      </w:r>
+    </w:p>
+    <w:p>
+      <w:pPr>
+        <w:pStyle w:val="9"/>
+        <w:keepNext w:val="0"/>
+        <w:keepLines w:val="0"/>
+        <w:widowControl/>
+        <w:suppressLineNumbers w:val="0"/>
+      </w:pPr>
+      <w:r>
+        <w:rPr>
+          <w:rStyle w:val="10"/>
+        </w:rPr>
+        <w:t>Finding:</w:t>
+      </w:r>
+      <w:r>
+        <w:t xml:space="preserve"> Every participant had experienced long queues at least once, confirming that waiting times are a common issue within the university.</w:t>
+      </w:r>
+    </w:p>
+    <w:p>
+      <w:pPr>
+        <w:keepNext w:val="0"/>
+        <w:keepLines w:val="0"/>
+        <w:widowControl/>
+        <w:suppressLineNumbers w:val="0"/>
+      </w:pPr>
+      <w:r>
+        <w:pict>
+          <v:rect id="_x0000_i1028" o:spt="1" style="height:1.5pt;width:432pt;" fillcolor="#A0A0A0" filled="t" stroked="f" coordsize="21600,21600" o:hr="t" o:hrstd="t" o:hralign="center">
+            <v:path/>
+            <v:fill on="t" focussize="0,0"/>
+            <v:stroke on="f"/>
+            <v:imagedata o:title=""/>
+            <o:lock v:ext="edit"/>
+            <w10:wrap type="none"/>
+            <w10:anchorlock/>
+          </v:rect>
+        </w:pict>
+      </w:r>
+    </w:p>
+    <w:p>
+      <w:pPr>
+        <w:pStyle w:val="3"/>
+        <w:keepNext w:val="0"/>
+        <w:keepLines w:val="0"/>
+        <w:widowControl/>
+        <w:suppressLineNumbers w:val="0"/>
+      </w:pPr>
+      <w:r>
+        <w:t>5. Preferred Method of Joining a Queue</w:t>
+      </w:r>
+    </w:p>
+    <w:p>
+      <w:pPr>
+        <w:pStyle w:val="9"/>
+        <w:keepNext w:val="0"/>
+        <w:keepLines w:val="0"/>
+        <w:widowControl/>
+        <w:suppressLineNumbers w:val="0"/>
+      </w:pPr>
+      <w:r>
+        <w:t>Participants were asked how they would prefer to join and track a queue.</w:t>
+      </w:r>
+    </w:p>
+    <w:p>
+      <w:pPr>
+        <w:pStyle w:val="9"/>
+        <w:keepNext w:val="0"/>
+        <w:keepLines w:val="0"/>
+        <w:widowControl/>
+        <w:suppressLineNumbers w:val="0"/>
+      </w:pPr>
+      <w:r>
+        <w:t>The results indicated that:</w:t>
+      </w:r>
+    </w:p>
+    <w:p>
+      <w:pPr>
+        <w:keepNext w:val="0"/>
+        <w:keepLines w:val="0"/>
+        <w:widowControl/>
+        <w:numPr>
+          <w:ilvl w:val="0"/>
+          <w:numId w:val="3"/>
+        </w:numPr>
+        <w:suppressLineNumbers w:val="0"/>
+        <w:spacing w:before="0" w:beforeAutospacing="1" w:after="0" w:afterAutospacing="1"/>
+        <w:ind w:left="720" w:hanging="360"/>
+      </w:pPr>
+      <w:r>
+        <w:rPr>
+          <w:rStyle w:val="10"/>
+        </w:rPr>
+        <w:t>71.4%</w:t>
+      </w:r>
+      <w:r>
+        <w:t xml:space="preserve"> preferred joining a queue </w:t>
+      </w:r>
+      <w:r>
+        <w:rPr>
+          <w:rStyle w:val="10"/>
+        </w:rPr>
+        <w:t>remotely through a mobile application</w:t>
+      </w:r>
+      <w:r>
+        <w:t xml:space="preserve">. </w:t>
+      </w:r>
+    </w:p>
+    <w:p>
+      <w:pPr>
+        <w:keepNext w:val="0"/>
+        <w:keepLines w:val="0"/>
+        <w:widowControl/>
+        <w:numPr>
+          <w:ilvl w:val="0"/>
+          <w:numId w:val="3"/>
+        </w:numPr>
+        <w:suppressLineNumbers w:val="0"/>
+        <w:spacing w:before="0" w:beforeAutospacing="1" w:after="0" w:afterAutospacing="1"/>
+        <w:ind w:left="720" w:hanging="360"/>
+      </w:pPr>
+      <w:r>
+        <w:rPr>
+          <w:rStyle w:val="10"/>
+        </w:rPr>
+        <w:t>21.4%</w:t>
+      </w:r>
+      <w:r>
+        <w:t xml:space="preserve"> preferred taking a physical ticket and waiting on-site. </w:t>
+      </w:r>
+    </w:p>
+    <w:p>
+      <w:pPr>
+        <w:keepNext w:val="0"/>
+        <w:keepLines w:val="0"/>
+        <w:widowControl/>
+        <w:numPr>
+          <w:ilvl w:val="0"/>
+          <w:numId w:val="3"/>
+        </w:numPr>
+        <w:suppressLineNumbers w:val="0"/>
+        <w:spacing w:before="0" w:beforeAutospacing="1" w:after="0" w:afterAutospacing="1"/>
+        <w:ind w:left="720" w:hanging="360"/>
+      </w:pPr>
+      <w:r>
+        <w:rPr>
+          <w:rStyle w:val="10"/>
+        </w:rPr>
+        <w:t>7.1%</w:t>
+      </w:r>
+      <w:r>
+        <w:t xml:space="preserve"> had no preference. </w:t>
+      </w:r>
+    </w:p>
+    <w:p>
+      <w:pPr>
+        <w:pStyle w:val="9"/>
+        <w:keepNext w:val="0"/>
+        <w:keepLines w:val="0"/>
+        <w:widowControl/>
+        <w:suppressLineNumbers w:val="0"/>
+      </w:pPr>
+      <w:r>
+        <w:rPr>
+          <w:rStyle w:val="10"/>
+        </w:rPr>
+        <w:t>Finding:</w:t>
+      </w:r>
+      <w:r>
+        <w:t xml:space="preserve"> There is strong support for replacing traditional physical queues with a virtual queue management system.</w:t>
+      </w:r>
+    </w:p>
+    <w:p>
+      <w:pPr>
+        <w:keepNext w:val="0"/>
+        <w:keepLines w:val="0"/>
+        <w:widowControl/>
+        <w:suppressLineNumbers w:val="0"/>
+      </w:pPr>
+      <w:r>
+        <w:pict>
+          <v:rect id="_x0000_i1029" o:spt="1" style="height:1.5pt;width:432pt;" fillcolor="#A0A0A0" filled="t" stroked="f" coordsize="21600,21600" o:hr="t" o:hrstd="t" o:hralign="center">
+            <v:path/>
+            <v:fill on="t" focussize="0,0"/>
+            <v:stroke on="f"/>
+            <v:imagedata o:title=""/>
+            <o:lock v:ext="edit"/>
+            <w10:wrap type="none"/>
+            <w10:anchorlock/>
+          </v:rect>
+        </w:pict>
+      </w:r>
+    </w:p>
+    <w:p>
+      <w:pPr>
+        <w:pStyle w:val="3"/>
+        <w:keepNext w:val="0"/>
+        <w:keepLines w:val="0"/>
+        <w:widowControl/>
+        <w:suppressLineNumbers w:val="0"/>
+      </w:pPr>
+      <w:r>
+        <w:t>6. Willingness to Use the Proposed Mobile Application</w:t>
+      </w:r>
+    </w:p>
+    <w:p>
+      <w:pPr>
+        <w:pStyle w:val="9"/>
+        <w:keepNext w:val="0"/>
+        <w:keepLines w:val="0"/>
+        <w:widowControl/>
+        <w:suppressLineNumbers w:val="0"/>
+      </w:pPr>
+      <w:r>
+        <w:t>Participants rated how likely they would be to use a mobile application that allows them to join a virtual queue, monitor their position, and receive notifications before their turn.</w:t>
+      </w:r>
+    </w:p>
+    <w:p>
+      <w:pPr>
+        <w:pStyle w:val="9"/>
+        <w:keepNext w:val="0"/>
+        <w:keepLines w:val="0"/>
+        <w:widowControl/>
+        <w:suppressLineNumbers w:val="0"/>
+      </w:pPr>
+      <w:r>
+        <w:t xml:space="preserve">The responses produced an </w:t>
+      </w:r>
+      <w:r>
+        <w:rPr>
+          <w:rStyle w:val="10"/>
+        </w:rPr>
+        <w:t>average rating of 4.0 out of 5</w:t>
+      </w:r>
+      <w:r>
+        <w:t xml:space="preserve">. Most participants selected ratings of </w:t>
+      </w:r>
+      <w:r>
+        <w:rPr>
+          <w:rStyle w:val="10"/>
+        </w:rPr>
+        <w:t>4</w:t>
+      </w:r>
+      <w:r>
+        <w:t xml:space="preserve"> or </w:t>
+      </w:r>
+      <w:r>
+        <w:rPr>
+          <w:rStyle w:val="10"/>
+        </w:rPr>
+        <w:t>5</w:t>
+      </w:r>
+      <w:r>
+        <w:t>, indicating a high level of acceptance.</w:t>
+      </w:r>
+    </w:p>
+    <w:p>
+      <w:pPr>
+        <w:pStyle w:val="9"/>
+        <w:keepNext w:val="0"/>
+        <w:keepLines w:val="0"/>
+        <w:widowControl/>
+        <w:suppressLineNumbers w:val="0"/>
+      </w:pPr>
+      <w:r>
+        <w:rPr>
+          <w:rStyle w:val="10"/>
+        </w:rPr>
+        <w:t>Finding:</w:t>
+      </w:r>
+      <w:r>
+        <w:t xml:space="preserve"> Users are generally willing to adopt a virtual queue management application if it provides convenient queue tracking and timely notifications.</w:t>
+      </w:r>
+    </w:p>
+    <w:p>
+      <w:pPr>
+        <w:keepNext w:val="0"/>
+        <w:keepLines w:val="0"/>
+        <w:widowControl/>
+        <w:suppressLineNumbers w:val="0"/>
+      </w:pPr>
+      <w:r>
+        <w:pict>
+          <v:rect id="_x0000_i1030" o:spt="1" style="height:1.5pt;width:432pt;" fillcolor="#A0A0A0" filled="t" stroked="f" coordsize="21600,21600" o:hr="t" o:hrstd="t" o:hralign="center">
+            <v:path/>
+            <v:fill on="t" focussize="0,0"/>
+            <v:stroke on="f"/>
+            <v:imagedata o:title=""/>
+            <o:lock v:ext="edit"/>
+            <w10:wrap type="none"/>
+            <w10:anchorlock/>
+          </v:rect>
+        </w:pict>
+      </w:r>
+    </w:p>
+    <w:p>
+      <w:pPr>
+        <w:pStyle w:val="2"/>
+        <w:keepNext w:val="0"/>
+        <w:keepLines w:val="0"/>
+        <w:widowControl/>
+        <w:suppressLineNumbers w:val="0"/>
+      </w:pPr>
+      <w:r>
+        <w:t>Common Themes</w:t>
+      </w:r>
+    </w:p>
+    <w:p>
+      <w:pPr>
+        <w:pStyle w:val="9"/>
+        <w:keepNext w:val="0"/>
+        <w:keepLines w:val="0"/>
+        <w:widowControl/>
+        <w:suppressLineNumbers w:val="0"/>
+      </w:pPr>
+      <w:r>
+        <w:t>The analysis of the responses revealed several recurring themes:</w:t>
+      </w:r>
+    </w:p>
+    <w:p>
+      <w:pPr>
+        <w:keepNext w:val="0"/>
+        <w:keepLines w:val="0"/>
+        <w:widowControl/>
+        <w:numPr>
+          <w:ilvl w:val="0"/>
+          <w:numId w:val="4"/>
+        </w:numPr>
+        <w:suppressLineNumbers w:val="0"/>
+        <w:spacing w:before="0" w:beforeAutospacing="1" w:after="0" w:afterAutospacing="1"/>
+        <w:ind w:left="720" w:hanging="360"/>
+      </w:pPr>
+      <w:r>
+        <w:t xml:space="preserve">Long queues remain a common challenge at university service points. </w:t>
+      </w:r>
+    </w:p>
+    <w:p>
+      <w:pPr>
+        <w:keepNext w:val="0"/>
+        <w:keepLines w:val="0"/>
+        <w:widowControl/>
+        <w:numPr>
+          <w:ilvl w:val="0"/>
+          <w:numId w:val="4"/>
+        </w:numPr>
+        <w:suppressLineNumbers w:val="0"/>
+        <w:spacing w:before="0" w:beforeAutospacing="1" w:after="0" w:afterAutospacing="1"/>
+        <w:ind w:left="720" w:hanging="360"/>
+      </w:pPr>
+      <w:r>
+        <w:t xml:space="preserve">Students prefer solutions that allow them to continue with other activities instead of waiting in line. </w:t>
+      </w:r>
+    </w:p>
+    <w:p>
+      <w:pPr>
+        <w:keepNext w:val="0"/>
+        <w:keepLines w:val="0"/>
+        <w:widowControl/>
+        <w:numPr>
+          <w:ilvl w:val="0"/>
+          <w:numId w:val="4"/>
+        </w:numPr>
+        <w:suppressLineNumbers w:val="0"/>
+        <w:spacing w:before="0" w:beforeAutospacing="1" w:after="0" w:afterAutospacing="1"/>
+        <w:ind w:left="720" w:hanging="360"/>
+      </w:pPr>
+      <w:r>
+        <w:t xml:space="preserve">Users value transparency and want to know their queue position and estimated waiting time. </w:t>
+      </w:r>
+    </w:p>
+    <w:p>
+      <w:pPr>
+        <w:keepNext w:val="0"/>
+        <w:keepLines w:val="0"/>
+        <w:widowControl/>
+        <w:numPr>
+          <w:ilvl w:val="0"/>
+          <w:numId w:val="4"/>
+        </w:numPr>
+        <w:suppressLineNumbers w:val="0"/>
+        <w:spacing w:before="0" w:beforeAutospacing="1" w:after="0" w:afterAutospacing="1"/>
+        <w:ind w:left="720" w:hanging="360"/>
+      </w:pPr>
+      <w:r>
+        <w:t xml:space="preserve">Mobile notifications are considered an important feature for preventing missed turns. </w:t>
+      </w:r>
+    </w:p>
+    <w:p>
+      <w:pPr>
+        <w:keepNext w:val="0"/>
+        <w:keepLines w:val="0"/>
+        <w:widowControl/>
+        <w:numPr>
+          <w:ilvl w:val="0"/>
+          <w:numId w:val="4"/>
+        </w:numPr>
+        <w:suppressLineNumbers w:val="0"/>
+        <w:spacing w:before="0" w:beforeAutospacing="1" w:after="0" w:afterAutospacing="1"/>
+        <w:ind w:left="720" w:hanging="360"/>
+      </w:pPr>
+      <w:r>
+        <w:t xml:space="preserve">There is strong acceptance of a virtual queue management system among the participants. </w:t>
+      </w:r>
+    </w:p>
+    <w:p>
+      <w:pPr>
+        <w:keepNext w:val="0"/>
+        <w:keepLines w:val="0"/>
+        <w:widowControl/>
+        <w:suppressLineNumbers w:val="0"/>
+      </w:pPr>
+      <w:r>
+        <w:pict>
+          <v:rect id="_x0000_i1031" o:spt="1" style="height:1.5pt;width:432pt;" fillcolor="#A0A0A0" filled="t" stroked="f" coordsize="21600,21600" o:hr="t" o:hrstd="t" o:hralign="center">
+            <v:path/>
+            <v:fill on="t" focussize="0,0"/>
+            <v:stroke on="f"/>
+            <v:imagedata o:title=""/>
+            <o:lock v:ext="edit"/>
+            <w10:wrap type="none"/>
+            <w10:anchorlock/>
+          </v:rect>
+        </w:pict>
+      </w:r>
+    </w:p>
+    <w:p>
+      <w:pPr>
+        <w:pStyle w:val="2"/>
+        <w:keepNext w:val="0"/>
+        <w:keepLines w:val="0"/>
+        <w:widowControl/>
+        <w:suppressLineNumbers w:val="0"/>
+      </w:pPr>
+      <w:r>
+        <w:t>Key Insights</w:t>
+      </w:r>
+    </w:p>
+    <w:p>
+      <w:pPr>
+        <w:pStyle w:val="9"/>
+        <w:keepNext w:val="0"/>
+        <w:keepLines w:val="0"/>
+        <w:widowControl/>
+        <w:suppressLineNumbers w:val="0"/>
+      </w:pPr>
+      <w:r>
+        <w:t>The findings indicate that the proposed Virtual Queue Management Mobile Application should prioritize:</w:t>
+      </w:r>
+    </w:p>
+    <w:p>
+      <w:pPr>
+        <w:keepNext w:val="0"/>
+        <w:keepLines w:val="0"/>
+        <w:widowControl/>
+        <w:numPr>
+          <w:ilvl w:val="0"/>
+          <w:numId w:val="5"/>
+        </w:numPr>
+        <w:suppressLineNumbers w:val="0"/>
+        <w:spacing w:before="0" w:beforeAutospacing="1" w:after="0" w:afterAutospacing="1"/>
+        <w:ind w:left="720" w:hanging="360"/>
+      </w:pPr>
+      <w:r>
+        <w:t xml:space="preserve">Remote queue registration. </w:t>
+      </w:r>
+    </w:p>
+    <w:p>
+      <w:pPr>
+        <w:keepNext w:val="0"/>
+        <w:keepLines w:val="0"/>
+        <w:widowControl/>
+        <w:numPr>
+          <w:ilvl w:val="0"/>
+          <w:numId w:val="5"/>
+        </w:numPr>
+        <w:suppressLineNumbers w:val="0"/>
+        <w:spacing w:before="0" w:beforeAutospacing="1" w:after="0" w:afterAutospacing="1"/>
+        <w:ind w:left="720" w:hanging="360"/>
+      </w:pPr>
+      <w:r>
+        <w:t xml:space="preserve">Real-time queue position tracking. </w:t>
+      </w:r>
+    </w:p>
+    <w:p>
+      <w:pPr>
+        <w:keepNext w:val="0"/>
+        <w:keepLines w:val="0"/>
+        <w:widowControl/>
+        <w:numPr>
+          <w:ilvl w:val="0"/>
+          <w:numId w:val="5"/>
+        </w:numPr>
+        <w:suppressLineNumbers w:val="0"/>
+        <w:spacing w:before="0" w:beforeAutospacing="1" w:after="0" w:afterAutospacing="1"/>
+        <w:ind w:left="720" w:hanging="360"/>
+      </w:pPr>
+      <w:r>
+        <w:t xml:space="preserve">Estimated waiting times. </w:t>
+      </w:r>
+    </w:p>
+    <w:p>
+      <w:pPr>
+        <w:keepNext w:val="0"/>
+        <w:keepLines w:val="0"/>
+        <w:widowControl/>
+        <w:numPr>
+          <w:ilvl w:val="0"/>
+          <w:numId w:val="5"/>
+        </w:numPr>
+        <w:suppressLineNumbers w:val="0"/>
+        <w:spacing w:before="0" w:beforeAutospacing="1" w:after="0" w:afterAutospacing="1"/>
+        <w:ind w:left="720" w:hanging="360"/>
+      </w:pPr>
+      <w:r>
+        <w:t xml:space="preserve">Push notifications before a user's turn. </w:t>
+      </w:r>
+    </w:p>
+    <w:p>
+      <w:pPr>
+        <w:keepNext w:val="0"/>
+        <w:keepLines w:val="0"/>
+        <w:widowControl/>
+        <w:numPr>
+          <w:ilvl w:val="0"/>
+          <w:numId w:val="5"/>
+        </w:numPr>
+        <w:suppressLineNumbers w:val="0"/>
+        <w:spacing w:before="0" w:beforeAutospacing="1" w:after="0" w:afterAutospacing="1"/>
+        <w:ind w:left="720" w:hanging="360"/>
+      </w:pPr>
+      <w:r>
+        <w:t xml:space="preserve">Support for multiple university service points. </w:t>
+      </w:r>
+    </w:p>
+    <w:p>
+      <w:pPr>
+        <w:keepNext w:val="0"/>
+        <w:keepLines w:val="0"/>
+        <w:widowControl/>
+        <w:numPr>
+          <w:ilvl w:val="0"/>
+          <w:numId w:val="5"/>
+        </w:numPr>
+        <w:suppressLineNumbers w:val="0"/>
+        <w:spacing w:before="0" w:beforeAutospacing="1" w:after="0" w:afterAutospacing="1"/>
+        <w:ind w:left="720" w:hanging="360"/>
+      </w:pPr>
+      <w:r>
+        <w:t xml:space="preserve">A simple, intuitive, and accessible user interface. </w:t>
+      </w:r>
+    </w:p>
+    <w:p>
+      <w:pPr>
+        <w:keepNext w:val="0"/>
+        <w:keepLines w:val="0"/>
+        <w:widowControl/>
+        <w:suppressLineNumbers w:val="0"/>
+      </w:pPr>
+      <w:r>
+        <w:pict>
+          <v:rect id="_x0000_i1032" o:spt="1" style="height:1.5pt;width:432pt;" fillcolor="#A0A0A0" filled="t" stroked="f" coordsize="21600,21600" o:hr="t" o:hrstd="t" o:hralign="center">
+            <v:path/>
+            <v:fill on="t" focussize="0,0"/>
+            <v:stroke on="f"/>
+            <v:imagedata o:title=""/>
+            <o:lock v:ext="edit"/>
+            <w10:wrap type="none"/>
+            <w10:anchorlock/>
+          </v:rect>
+        </w:pict>
+      </w:r>
+    </w:p>
+    <w:p>
+      <w:pPr>
+        <w:pStyle w:val="2"/>
+        <w:keepNext w:val="0"/>
+        <w:keepLines w:val="0"/>
+        <w:widowControl/>
+        <w:suppressLineNumbers w:val="0"/>
+      </w:pPr>
+      <w:r>
+        <w:t>Surprising Findings</w:t>
+      </w:r>
+    </w:p>
+    <w:p>
+      <w:pPr>
+        <w:pStyle w:val="9"/>
+        <w:keepNext w:val="0"/>
+        <w:keepLines w:val="0"/>
+        <w:widowControl/>
+        <w:suppressLineNumbers w:val="0"/>
+      </w:pPr>
+      <w:r>
+        <w:t>Although the application is primarily intended for students, respondents from different user groups—including teaching staff, non-teaching staff, and visitors—also expressed interest in a virtual queue management system. Additionally, the Food's Mess emerged as one of the busiest locations, suggesting that virtual queue management could also be beneficial beyond administrative offices.</w:t>
+      </w:r>
+    </w:p>
+    <w:p>
+      <w:pPr>
+        <w:keepNext w:val="0"/>
+        <w:keepLines w:val="0"/>
+        <w:widowControl/>
+        <w:suppressLineNumbers w:val="0"/>
+      </w:pPr>
+      <w:r>
+        <w:pict>
+          <v:rect id="_x0000_i1033" o:spt="1" style="height:1.5pt;width:432pt;" fillcolor="#A0A0A0" filled="t" stroked="f" coordsize="21600,21600" o:hr="t" o:hrstd="t" o:hralign="center">
+            <v:path/>
+            <v:fill on="t" focussize="0,0"/>
+            <v:stroke on="f"/>
+            <v:imagedata o:title=""/>
+            <o:lock v:ext="edit"/>
+            <w10:wrap type="none"/>
+            <w10:anchorlock/>
+          </v:rect>
+        </w:pict>
+      </w:r>
+    </w:p>
+    <w:p>
+      <w:pPr>
+        <w:pStyle w:val="9"/>
+        <w:keepNext w:val="0"/>
+        <w:keepLines w:val="0"/>
+        <w:widowControl/>
+        <w:suppressLineNumbers w:val="0"/>
+      </w:pPr>
+      <w:r>
+        <w:t>This research confirms that physical queueing is a significant challenge within the university. The strong preference for mobile-based queue management and the high willingness to adopt the proposed application provide clear evidence that a Virtual Queue Management Mobile Application would address real user needs while improving convenience, efficiency, and the overall user experience.</w:t>
+      </w:r>
+    </w:p>
+    <w:p>
+      <w:pPr>
+        <w:pStyle w:val="11"/>
+      </w:pPr>
+      <w:r>
+        <w:t>窗体顶端</w:t>
+      </w:r>
+    </w:p>
+    <w:p>
+      <w:pPr>
+        <w:keepNext w:val="0"/>
+        <w:keepLines w:val="0"/>
+        <w:widowControl/>
+        <w:suppressLineNumbers w:val="0"/>
+        <w:jc w:val="left"/>
+      </w:pPr>
+      <w:r>
+        <w:rPr>
+          <w:rFonts w:ascii="SimSun" w:hAnsi="SimSun" w:eastAsia="SimSun" w:cs="SimSun"/>
+          <w:kern w:val="0"/>
+          <w:sz w:val="24"/>
+          <w:szCs w:val="24"/>
+          <w:lang w:val="en-US" w:eastAsia="zh-CN" w:bidi="ar"/>
+        </w:rPr>
+        <w:object>
+          <v:shape id="_x0000_i1034" o:spt="201" type="#_x0000_t201" style="height:0pt;width:0.05pt;" o:ole="t" filled="f" coordsize="21600,21600">
+            <v:path/>
+            <v:fill on="f" focussize="0,0"/>
+            <v:stroke/>
+            <v:imagedata o:title=""/>
+            <o:lock v:ext="edit" aspectratio="t"/>
+            <w10:wrap type="none"/>
+            <w10:anchorlock/>
+          </v:shape>
+        </w:object>
+      </w:r>
+    </w:p>
+    <w:p>
+      <w:pPr>
+        <w:pStyle w:val="9"/>
+        <w:keepNext w:val="0"/>
+        <w:keepLines w:val="0"/>
+        <w:widowControl/>
+        <w:suppressLineNumbers w:val="0"/>
+        <w:spacing w:before="0" w:beforeAutospacing="1" w:after="0" w:afterAutospacing="1"/>
+        <w:ind w:left="0" w:right="0"/>
+      </w:pPr>
+    </w:p>
+    <w:p>
+      <w:pPr>
+        <w:pStyle w:val="12"/>
+      </w:pPr>
+      <w:r>
+        <w:t>窗体底端</w:t>
+      </w:r>
+    </w:p>
+    <w:p>
+      <w:pPr>
         <w:rPr>
           <w:rFonts w:hint="default" w:ascii="SimSun" w:hAnsi="SimSun" w:eastAsia="SimSun" w:cs="SimSun"/>
           <w:sz w:val="24"/>
@@ -1206,6 +2574,308 @@
           <w:lang w:val="en-US"/>
         </w:rPr>
       </w:pPr>
+      <w:r>
+        <w:rPr>
+          <w:rFonts w:ascii="SimSun" w:hAnsi="SimSun" w:eastAsia="SimSun" w:cs="SimSun"/>
+          <w:b w:val="0"/>
+          <w:bCs w:val="0"/>
+          <w:sz w:val="24"/>
+          <w:szCs w:val="24"/>
+        </w:rPr>
+        <w:drawing>
+          <wp:inline distT="0" distB="0" distL="114300" distR="114300">
+            <wp:extent cx="20916900" cy="9486900"/>
+            <wp:effectExtent l="0" t="0" r="7620" b="7620"/>
+            <wp:docPr id="2" name="Picture 12" descr="IMG_256"/>
+            <wp:cNvGraphicFramePr>
+              <a:graphicFrameLocks xmlns:a="http://schemas.openxmlformats.org/drawingml/2006/main" noChangeAspect="1"/>
+            </wp:cNvGraphicFramePr>
+            <a:graphic xmlns:a="http://schemas.openxmlformats.org/drawingml/2006/main">
+              <a:graphicData uri="http://schemas.openxmlformats.org/drawingml/2006/picture">
+                <pic:pic xmlns:pic="http://schemas.openxmlformats.org/drawingml/2006/picture">
+                  <pic:nvPicPr>
+                    <pic:cNvPr id="2" name="Picture 12" descr="IMG_256"/>
+                    <pic:cNvPicPr>
+                      <a:picLocks noChangeAspect="1"/>
+                    </pic:cNvPicPr>
+                  </pic:nvPicPr>
+                  <pic:blipFill>
+                    <a:blip r:embed="rId9"/>
+                    <a:stretch>
+                      <a:fillRect/>
+                    </a:stretch>
+                  </pic:blipFill>
+                  <pic:spPr>
+                    <a:xfrm>
+                      <a:off x="0" y="0"/>
+                      <a:ext cx="20916900" cy="9486900"/>
+                    </a:xfrm>
+                    <a:prstGeom prst="rect">
+                      <a:avLst/>
+                    </a:prstGeom>
+                    <a:noFill/>
+                    <a:ln w="9525">
+                      <a:noFill/>
+                    </a:ln>
+                  </pic:spPr>
+                </pic:pic>
+              </a:graphicData>
+            </a:graphic>
+          </wp:inline>
+        </w:drawing>
+      </w:r>
+      <w:r>
+        <w:rPr>
+          <w:rFonts w:ascii="SimSun" w:hAnsi="SimSun" w:eastAsia="SimSun" w:cs="SimSun"/>
+          <w:b w:val="0"/>
+          <w:bCs w:val="0"/>
+          <w:sz w:val="24"/>
+          <w:szCs w:val="24"/>
+        </w:rPr>
+        <w:drawing>
+          <wp:inline distT="0" distB="0" distL="114300" distR="114300">
+            <wp:extent cx="12839700" cy="6104255"/>
+            <wp:effectExtent l="0" t="0" r="7620" b="6985"/>
+            <wp:docPr id="3" name="Picture 13" descr="IMG_256"/>
+            <wp:cNvGraphicFramePr>
+              <a:graphicFrameLocks xmlns:a="http://schemas.openxmlformats.org/drawingml/2006/main" noChangeAspect="1"/>
+            </wp:cNvGraphicFramePr>
+            <a:graphic xmlns:a="http://schemas.openxmlformats.org/drawingml/2006/main">
+              <a:graphicData uri="http://schemas.openxmlformats.org/drawingml/2006/picture">
+                <pic:pic xmlns:pic="http://schemas.openxmlformats.org/drawingml/2006/picture">
+                  <pic:nvPicPr>
+                    <pic:cNvPr id="3" name="Picture 13" descr="IMG_256"/>
+                    <pic:cNvPicPr>
+                      <a:picLocks noChangeAspect="1"/>
+                    </pic:cNvPicPr>
+                  </pic:nvPicPr>
+                  <pic:blipFill>
+                    <a:blip r:embed="rId10"/>
+                    <a:stretch>
+                      <a:fillRect/>
+                    </a:stretch>
+                  </pic:blipFill>
+                  <pic:spPr>
+                    <a:xfrm>
+                      <a:off x="0" y="0"/>
+                      <a:ext cx="12839700" cy="6104255"/>
+                    </a:xfrm>
+                    <a:prstGeom prst="rect">
+                      <a:avLst/>
+                    </a:prstGeom>
+                    <a:noFill/>
+                    <a:ln w="9525">
+                      <a:noFill/>
+                    </a:ln>
+                  </pic:spPr>
+                </pic:pic>
+              </a:graphicData>
+            </a:graphic>
+          </wp:inline>
+        </w:drawing>
+      </w:r>
+      <w:r>
+        <w:rPr>
+          <w:rFonts w:ascii="SimSun" w:hAnsi="SimSun" w:eastAsia="SimSun" w:cs="SimSun"/>
+          <w:b w:val="0"/>
+          <w:bCs w:val="0"/>
+          <w:sz w:val="24"/>
+          <w:szCs w:val="24"/>
+        </w:rPr>
+        <w:drawing>
+          <wp:inline distT="0" distB="0" distL="114300" distR="114300">
+            <wp:extent cx="14698980" cy="6184900"/>
+            <wp:effectExtent l="0" t="0" r="7620" b="2540"/>
+            <wp:docPr id="6" name="Picture 14" descr="IMG_256"/>
+            <wp:cNvGraphicFramePr>
+              <a:graphicFrameLocks xmlns:a="http://schemas.openxmlformats.org/drawingml/2006/main" noChangeAspect="1"/>
+            </wp:cNvGraphicFramePr>
+            <a:graphic xmlns:a="http://schemas.openxmlformats.org/drawingml/2006/main">
+              <a:graphicData uri="http://schemas.openxmlformats.org/drawingml/2006/picture">
+                <pic:pic xmlns:pic="http://schemas.openxmlformats.org/drawingml/2006/picture">
+                  <pic:nvPicPr>
+                    <pic:cNvPr id="6" name="Picture 14" descr="IMG_256"/>
+                    <pic:cNvPicPr>
+                      <a:picLocks noChangeAspect="1"/>
+                    </pic:cNvPicPr>
+                  </pic:nvPicPr>
+                  <pic:blipFill>
+                    <a:blip r:embed="rId11"/>
+                    <a:stretch>
+                      <a:fillRect/>
+                    </a:stretch>
+                  </pic:blipFill>
+                  <pic:spPr>
+                    <a:xfrm>
+                      <a:off x="0" y="0"/>
+                      <a:ext cx="14698980" cy="6184900"/>
+                    </a:xfrm>
+                    <a:prstGeom prst="rect">
+                      <a:avLst/>
+                    </a:prstGeom>
+                    <a:noFill/>
+                    <a:ln w="9525">
+                      <a:noFill/>
+                    </a:ln>
+                  </pic:spPr>
+                </pic:pic>
+              </a:graphicData>
+            </a:graphic>
+          </wp:inline>
+        </w:drawing>
+      </w:r>
+      <w:r>
+        <w:rPr>
+          <w:rFonts w:ascii="SimSun" w:hAnsi="SimSun" w:eastAsia="SimSun" w:cs="SimSun"/>
+          <w:b w:val="0"/>
+          <w:bCs w:val="0"/>
+          <w:sz w:val="24"/>
+          <w:szCs w:val="24"/>
+        </w:rPr>
+        <w:drawing>
+          <wp:inline distT="0" distB="0" distL="114300" distR="114300">
+            <wp:extent cx="13815060" cy="5812790"/>
+            <wp:effectExtent l="0" t="0" r="7620" b="8890"/>
+            <wp:docPr id="7" name="Picture 15" descr="IMG_256"/>
+            <wp:cNvGraphicFramePr>
+              <a:graphicFrameLocks xmlns:a="http://schemas.openxmlformats.org/drawingml/2006/main" noChangeAspect="1"/>
+            </wp:cNvGraphicFramePr>
+            <a:graphic xmlns:a="http://schemas.openxmlformats.org/drawingml/2006/main">
+              <a:graphicData uri="http://schemas.openxmlformats.org/drawingml/2006/picture">
+                <pic:pic xmlns:pic="http://schemas.openxmlformats.org/drawingml/2006/picture">
+                  <pic:nvPicPr>
+                    <pic:cNvPr id="7" name="Picture 15" descr="IMG_256"/>
+                    <pic:cNvPicPr>
+                      <a:picLocks noChangeAspect="1"/>
+                    </pic:cNvPicPr>
+                  </pic:nvPicPr>
+                  <pic:blipFill>
+                    <a:blip r:embed="rId12"/>
+                    <a:stretch>
+                      <a:fillRect/>
+                    </a:stretch>
+                  </pic:blipFill>
+                  <pic:spPr>
+                    <a:xfrm>
+                      <a:off x="0" y="0"/>
+                      <a:ext cx="13815060" cy="5812790"/>
+                    </a:xfrm>
+                    <a:prstGeom prst="rect">
+                      <a:avLst/>
+                    </a:prstGeom>
+                    <a:noFill/>
+                    <a:ln w="9525">
+                      <a:noFill/>
+                    </a:ln>
+                  </pic:spPr>
+                </pic:pic>
+              </a:graphicData>
+            </a:graphic>
+          </wp:inline>
+        </w:drawing>
+      </w:r>
+      <w:bookmarkStart w:id="0" w:name="_GoBack"/>
+      <w:r>
+        <w:rPr>
+          <w:rFonts w:ascii="SimSun" w:hAnsi="SimSun" w:eastAsia="SimSun" w:cs="SimSun"/>
+          <w:b w:val="0"/>
+          <w:bCs w:val="0"/>
+          <w:sz w:val="24"/>
+          <w:szCs w:val="24"/>
+        </w:rPr>
+        <w:drawing>
+          <wp:inline distT="0" distB="0" distL="114300" distR="114300">
+            <wp:extent cx="16025495" cy="8143875"/>
+            <wp:effectExtent l="0" t="0" r="6985" b="9525"/>
+            <wp:docPr id="9" name="Picture 16" descr="IMG_256"/>
+            <wp:cNvGraphicFramePr>
+              <a:graphicFrameLocks xmlns:a="http://schemas.openxmlformats.org/drawingml/2006/main" noChangeAspect="1"/>
+            </wp:cNvGraphicFramePr>
+            <a:graphic xmlns:a="http://schemas.openxmlformats.org/drawingml/2006/main">
+              <a:graphicData uri="http://schemas.openxmlformats.org/drawingml/2006/picture">
+                <pic:pic xmlns:pic="http://schemas.openxmlformats.org/drawingml/2006/picture">
+                  <pic:nvPicPr>
+                    <pic:cNvPr id="9" name="Picture 16" descr="IMG_256"/>
+                    <pic:cNvPicPr>
+                      <a:picLocks noChangeAspect="1"/>
+                    </pic:cNvPicPr>
+                  </pic:nvPicPr>
+                  <pic:blipFill>
+                    <a:blip r:embed="rId13"/>
+                    <a:stretch>
+                      <a:fillRect/>
+                    </a:stretch>
+                  </pic:blipFill>
+                  <pic:spPr>
+                    <a:xfrm>
+                      <a:off x="0" y="0"/>
+                      <a:ext cx="16025495" cy="8143875"/>
+                    </a:xfrm>
+                    <a:prstGeom prst="rect">
+                      <a:avLst/>
+                    </a:prstGeom>
+                    <a:noFill/>
+                    <a:ln w="9525">
+                      <a:noFill/>
+                    </a:ln>
+                  </pic:spPr>
+                </pic:pic>
+              </a:graphicData>
+            </a:graphic>
+          </wp:inline>
+        </w:drawing>
+      </w:r>
+      <w:bookmarkEnd w:id="0"/>
+      <w:r>
+        <w:rPr>
+          <w:rFonts w:ascii="SimSun" w:hAnsi="SimSun" w:eastAsia="SimSun" w:cs="SimSun"/>
+          <w:b w:val="0"/>
+          <w:bCs w:val="0"/>
+          <w:sz w:val="24"/>
+          <w:szCs w:val="24"/>
+        </w:rPr>
+        <w:drawing>
+          <wp:inline distT="0" distB="0" distL="114300" distR="114300">
+            <wp:extent cx="11942445" cy="5024755"/>
+            <wp:effectExtent l="0" t="0" r="5715" b="4445"/>
+            <wp:docPr id="1" name="Picture 11" descr="IMG_256"/>
+            <wp:cNvGraphicFramePr>
+              <a:graphicFrameLocks xmlns:a="http://schemas.openxmlformats.org/drawingml/2006/main" noChangeAspect="1"/>
+            </wp:cNvGraphicFramePr>
+            <a:graphic xmlns:a="http://schemas.openxmlformats.org/drawingml/2006/main">
+              <a:graphicData uri="http://schemas.openxmlformats.org/drawingml/2006/picture">
+                <pic:pic xmlns:pic="http://schemas.openxmlformats.org/drawingml/2006/picture">
+                  <pic:nvPicPr>
+                    <pic:cNvPr id="1" name="Picture 11" descr="IMG_256"/>
+                    <pic:cNvPicPr>
+                      <a:picLocks noChangeAspect="1"/>
+                    </pic:cNvPicPr>
+                  </pic:nvPicPr>
+                  <pic:blipFill>
+                    <a:blip r:embed="rId7"/>
+                    <a:stretch>
+                      <a:fillRect/>
+                    </a:stretch>
+                  </pic:blipFill>
+                  <pic:spPr>
+                    <a:xfrm>
+                      <a:off x="0" y="0"/>
+                      <a:ext cx="11942445" cy="5024755"/>
+                    </a:xfrm>
+                    <a:prstGeom prst="rect">
+                      <a:avLst/>
+                    </a:prstGeom>
+                    <a:noFill/>
+                    <a:ln w="9525">
+                      <a:noFill/>
+                    </a:ln>
+                  </pic:spPr>
+                </pic:pic>
+              </a:graphicData>
+            </a:graphic>
+          </wp:inline>
+        </w:drawing>
+      </w:r>
     </w:p>
     <w:sectPr>
       <w:headerReference r:id="rId3" w:type="default"/>
@@ -1267,22 +2937,6 @@
                       <a:ln w="6350">
                         <a:noFill/>
                       </a:ln>
-                      <a:extLst>
-                        <a:ext uri="{909E8E84-426E-40DD-AFC4-6F175D3DCCD1}">
-                          <a14:hiddenFill xmlns:a14="http://schemas.microsoft.com/office/drawing/2010/main">
-                            <a:solidFill>
-                              <a:schemeClr val="lt1"/>
-                            </a:solidFill>
-                          </a14:hiddenFill>
-                        </a:ext>
-                        <a:ext uri="{91240B29-F687-4F45-9708-019B960494DF}">
-                          <a14:hiddenLine xmlns:a14="http://schemas.microsoft.com/office/drawing/2010/main" w="6350">
-                            <a:solidFill>
-                              <a:prstClr val="black"/>
-                            </a:solidFill>
-                          </a14:hiddenLine>
-                        </a:ext>
-                      </a:extLst>
                     </wps:spPr>
                     <wps:style>
                       <a:lnRef idx="0">
@@ -1333,7 +2987,7 @@
         </mc:Choice>
         <mc:Fallback>
           <w:pict>
-            <v:shape id="_x0000_s1026" o:spid="_x0000_s1026" o:spt="202" type="#_x0000_t202" style="position:absolute;left:0pt;margin-top:0pt;height:144pt;width:144pt;mso-position-horizontal:left;mso-position-horizontal-relative:margin;mso-wrap-style:none;z-index:251659264;mso-width-relative:page;mso-height-relative:page;" filled="f" stroked="f" coordsize="21600,21600" o:gfxdata="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">
+            <v:shape id="_x0000_s1026" o:spid="_x0000_s1026" o:spt="202" type="#_x0000_t202" style="position:absolute;left:0pt;margin-top:0pt;height:144pt;width:144pt;mso-position-horizontal:left;mso-position-horizontal-relative:margin;mso-wrap-style:none;z-index:251659264;mso-width-relative:page;mso-height-relative:page;" filled="f" stroked="f" coordsize="21600,21600" o:gfxdata="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">
               <v:fill on="f" focussize="0,0"/>
               <v:stroke on="f" weight="0.5pt"/>
               <v:imagedata o:title=""/>
@@ -1386,9 +3040,7 @@
         <w:lang w:val="en-US"/>
       </w:rPr>
     </w:pPr>
-    <w:bookmarkStart w:id="0" w:name="_GoBack"/>
   </w:p>
-  <w:bookmarkEnd w:id="0"/>
 </w:ftr>
 </file>
 
@@ -1400,6 +3052,771 @@
     </w:pPr>
   </w:p>
 </w:hdr>
+</file>
+
+<file path=word/numbering.xml><?xml version="1.0" encoding="utf-8"?>
+<w:numbering xmlns:wpc="http://schemas.microsoft.com/office/word/2010/wordprocessingCanvas" xmlns:mc="http://schemas.openxmlformats.org/markup-compatibility/2006" xmlns:o="urn:schemas-microsoft-com:office:office" xmlns:r="http://schemas.openxmlformats.org/officeDocument/2006/relationships" xmlns:m="http://schemas.openxmlformats.org/officeDocument/2006/math" xmlns:v="urn:schemas-microsoft-com:vml" xmlns:wp14="http://schemas.microsoft.com/office/word/2010/wordprocessingDrawing" xmlns:wp="http://schemas.openxmlformats.org/drawingml/2006/wordprocessingDrawing" xmlns:w10="urn:schemas-microsoft-com:office:word" xmlns:w="http://schemas.openxmlformats.org/wordprocessingml/2006/main" xmlns:w14="http://schemas.microsoft.com/office/word/2010/wordml" xmlns:wpg="http://schemas.microsoft.com/office/word/2010/wordprocessingGroup" xmlns:wpi="http://schemas.microsoft.com/office/word/2010/wordprocessingInk" xmlns:wne="http://schemas.microsoft.com/office/word/2006/wordml" xmlns:wps="http://schemas.microsoft.com/office/word/2010/wordprocessingShape" xmlns:wpsCustomData="http://www.wps.cn/officeDocument/2013/wpsCustomData" mc:Ignorable="w14 wp14">
+  <w:abstractNum w:abstractNumId="0">
+    <w:nsid w:val="A870522A"/>
+    <w:multiLevelType w:val="multilevel"/>
+    <w:tmpl w:val="A870522A"/>
+    <w:lvl w:ilvl="0" w:tentative="0">
+      <w:start w:val="1"/>
+      <w:numFmt w:val="bullet"/>
+      <w:lvlText w:val=""/>
+      <w:lvlJc w:val="left"/>
+      <w:pPr>
+        <w:tabs>
+          <w:tab w:val="left" w:pos="720"/>
+        </w:tabs>
+        <w:ind w:left="720" w:hanging="360"/>
+      </w:pPr>
+      <w:rPr>
+        <w:rFonts w:hint="default" w:ascii="Symbol" w:hAnsi="Symbol" w:cs="Symbol"/>
+        <w:sz w:val="20"/>
+      </w:rPr>
+    </w:lvl>
+    <w:lvl w:ilvl="1" w:tentative="0">
+      <w:start w:val="1"/>
+      <w:numFmt w:val="bullet"/>
+      <w:lvlText w:val="o"/>
+      <w:lvlJc w:val="left"/>
+      <w:pPr>
+        <w:tabs>
+          <w:tab w:val="left" w:pos="1440"/>
+        </w:tabs>
+        <w:ind w:left="1440" w:hanging="360"/>
+      </w:pPr>
+      <w:rPr>
+        <w:rFonts w:hint="default" w:ascii="Courier New" w:hAnsi="Courier New" w:cs="Courier New"/>
+        <w:sz w:val="20"/>
+      </w:rPr>
+    </w:lvl>
+    <w:lvl w:ilvl="2" w:tentative="0">
+      <w:start w:val="1"/>
+      <w:numFmt w:val="bullet"/>
+      <w:lvlText w:val=""/>
+      <w:lvlJc w:val="left"/>
+      <w:pPr>
+        <w:tabs>
+          <w:tab w:val="left" w:pos="2160"/>
+        </w:tabs>
+        <w:ind w:left="2160" w:hanging="360"/>
+      </w:pPr>
+      <w:rPr>
+        <w:rFonts w:hint="default" w:ascii="Wingdings" w:hAnsi="Wingdings" w:cs="Wingdings"/>
+        <w:sz w:val="20"/>
+      </w:rPr>
+    </w:lvl>
+    <w:lvl w:ilvl="3" w:tentative="0">
+      <w:start w:val="1"/>
+      <w:numFmt w:val="bullet"/>
+      <w:lvlText w:val=""/>
+      <w:lvlJc w:val="left"/>
+      <w:pPr>
+        <w:tabs>
+          <w:tab w:val="left" w:pos="2880"/>
+        </w:tabs>
+        <w:ind w:left="2880" w:hanging="360"/>
+      </w:pPr>
+      <w:rPr>
+        <w:rFonts w:hint="default" w:ascii="Wingdings" w:hAnsi="Wingdings" w:cs="Wingdings"/>
+        <w:sz w:val="20"/>
+      </w:rPr>
+    </w:lvl>
+    <w:lvl w:ilvl="4" w:tentative="0">
+      <w:start w:val="1"/>
+      <w:numFmt w:val="bullet"/>
+      <w:lvlText w:val=""/>
+      <w:lvlJc w:val="left"/>
+      <w:pPr>
+        <w:tabs>
+          <w:tab w:val="left" w:pos="3600"/>
+        </w:tabs>
+        <w:ind w:left="3600" w:hanging="360"/>
+      </w:pPr>
+      <w:rPr>
+        <w:rFonts w:hint="default" w:ascii="Wingdings" w:hAnsi="Wingdings" w:cs="Wingdings"/>
+        <w:sz w:val="20"/>
+      </w:rPr>
+    </w:lvl>
+    <w:lvl w:ilvl="5" w:tentative="0">
+      <w:start w:val="1"/>
+      <w:numFmt w:val="bullet"/>
+      <w:lvlText w:val=""/>
+      <w:lvlJc w:val="left"/>
+      <w:pPr>
+        <w:tabs>
+          <w:tab w:val="left" w:pos="4320"/>
+        </w:tabs>
+        <w:ind w:left="4320" w:hanging="360"/>
+      </w:pPr>
+      <w:rPr>
+        <w:rFonts w:hint="default" w:ascii="Wingdings" w:hAnsi="Wingdings" w:cs="Wingdings"/>
+        <w:sz w:val="20"/>
+      </w:rPr>
+    </w:lvl>
+    <w:lvl w:ilvl="6" w:tentative="0">
+      <w:start w:val="1"/>
+      <w:numFmt w:val="bullet"/>
+      <w:lvlText w:val=""/>
+      <w:lvlJc w:val="left"/>
+      <w:pPr>
+        <w:tabs>
+          <w:tab w:val="left" w:pos="5040"/>
+        </w:tabs>
+        <w:ind w:left="5040" w:hanging="360"/>
+      </w:pPr>
+      <w:rPr>
+        <w:rFonts w:hint="default" w:ascii="Wingdings" w:hAnsi="Wingdings" w:cs="Wingdings"/>
+        <w:sz w:val="20"/>
+      </w:rPr>
+    </w:lvl>
+    <w:lvl w:ilvl="7" w:tentative="0">
+      <w:start w:val="1"/>
+      <w:numFmt w:val="bullet"/>
+      <w:lvlText w:val=""/>
+      <w:lvlJc w:val="left"/>
+      <w:pPr>
+        <w:tabs>
+          <w:tab w:val="left" w:pos="5760"/>
+        </w:tabs>
+        <w:ind w:left="5760" w:hanging="360"/>
+      </w:pPr>
+      <w:rPr>
+        <w:rFonts w:hint="default" w:ascii="Wingdings" w:hAnsi="Wingdings" w:cs="Wingdings"/>
+        <w:sz w:val="20"/>
+      </w:rPr>
+    </w:lvl>
+    <w:lvl w:ilvl="8" w:tentative="0">
+      <w:start w:val="1"/>
+      <w:numFmt w:val="bullet"/>
+      <w:lvlText w:val=""/>
+      <w:lvlJc w:val="left"/>
+      <w:pPr>
+        <w:tabs>
+          <w:tab w:val="left" w:pos="6480"/>
+        </w:tabs>
+        <w:ind w:left="6480" w:hanging="360"/>
+      </w:pPr>
+      <w:rPr>
+        <w:rFonts w:hint="default" w:ascii="Wingdings" w:hAnsi="Wingdings" w:cs="Wingdings"/>
+        <w:sz w:val="20"/>
+      </w:rPr>
+    </w:lvl>
+  </w:abstractNum>
+  <w:abstractNum w:abstractNumId="1">
+    <w:nsid w:val="F3FE426C"/>
+    <w:multiLevelType w:val="multilevel"/>
+    <w:tmpl w:val="F3FE426C"/>
+    <w:lvl w:ilvl="0" w:tentative="0">
+      <w:start w:val="1"/>
+      <w:numFmt w:val="bullet"/>
+      <w:lvlText w:val=""/>
+      <w:lvlJc w:val="left"/>
+      <w:pPr>
+        <w:tabs>
+          <w:tab w:val="left" w:pos="720"/>
+        </w:tabs>
+        <w:ind w:left="720" w:hanging="360"/>
+      </w:pPr>
+      <w:rPr>
+        <w:rFonts w:hint="default" w:ascii="Symbol" w:hAnsi="Symbol" w:cs="Symbol"/>
+        <w:sz w:val="20"/>
+      </w:rPr>
+    </w:lvl>
+    <w:lvl w:ilvl="1" w:tentative="0">
+      <w:start w:val="1"/>
+      <w:numFmt w:val="bullet"/>
+      <w:lvlText w:val="o"/>
+      <w:lvlJc w:val="left"/>
+      <w:pPr>
+        <w:tabs>
+          <w:tab w:val="left" w:pos="1440"/>
+        </w:tabs>
+        <w:ind w:left="1440" w:hanging="360"/>
+      </w:pPr>
+      <w:rPr>
+        <w:rFonts w:hint="default" w:ascii="Courier New" w:hAnsi="Courier New" w:cs="Courier New"/>
+        <w:sz w:val="20"/>
+      </w:rPr>
+    </w:lvl>
+    <w:lvl w:ilvl="2" w:tentative="0">
+      <w:start w:val="1"/>
+      <w:numFmt w:val="bullet"/>
+      <w:lvlText w:val=""/>
+      <w:lvlJc w:val="left"/>
+      <w:pPr>
+        <w:tabs>
+          <w:tab w:val="left" w:pos="2160"/>
+        </w:tabs>
+        <w:ind w:left="2160" w:hanging="360"/>
+      </w:pPr>
+      <w:rPr>
+        <w:rFonts w:hint="default" w:ascii="Wingdings" w:hAnsi="Wingdings" w:cs="Wingdings"/>
+        <w:sz w:val="20"/>
+      </w:rPr>
+    </w:lvl>
+    <w:lvl w:ilvl="3" w:tentative="0">
+      <w:start w:val="1"/>
+      <w:numFmt w:val="bullet"/>
+      <w:lvlText w:val=""/>
+      <w:lvlJc w:val="left"/>
+      <w:pPr>
+        <w:tabs>
+          <w:tab w:val="left" w:pos="2880"/>
+        </w:tabs>
+        <w:ind w:left="2880" w:hanging="360"/>
+      </w:pPr>
+      <w:rPr>
+        <w:rFonts w:hint="default" w:ascii="Wingdings" w:hAnsi="Wingdings" w:cs="Wingdings"/>
+        <w:sz w:val="20"/>
+      </w:rPr>
+    </w:lvl>
+    <w:lvl w:ilvl="4" w:tentative="0">
+      <w:start w:val="1"/>
+      <w:numFmt w:val="bullet"/>
+      <w:lvlText w:val=""/>
+      <w:lvlJc w:val="left"/>
+      <w:pPr>
+        <w:tabs>
+          <w:tab w:val="left" w:pos="3600"/>
+        </w:tabs>
+        <w:ind w:left="3600" w:hanging="360"/>
+      </w:pPr>
+      <w:rPr>
+        <w:rFonts w:hint="default" w:ascii="Wingdings" w:hAnsi="Wingdings" w:cs="Wingdings"/>
+        <w:sz w:val="20"/>
+      </w:rPr>
+    </w:lvl>
+    <w:lvl w:ilvl="5" w:tentative="0">
+      <w:start w:val="1"/>
+      <w:numFmt w:val="bullet"/>
+      <w:lvlText w:val=""/>
+      <w:lvlJc w:val="left"/>
+      <w:pPr>
+        <w:tabs>
+          <w:tab w:val="left" w:pos="4320"/>
+        </w:tabs>
+        <w:ind w:left="4320" w:hanging="360"/>
+      </w:pPr>
+      <w:rPr>
+        <w:rFonts w:hint="default" w:ascii="Wingdings" w:hAnsi="Wingdings" w:cs="Wingdings"/>
+        <w:sz w:val="20"/>
+      </w:rPr>
+    </w:lvl>
+    <w:lvl w:ilvl="6" w:tentative="0">
+      <w:start w:val="1"/>
+      <w:numFmt w:val="bullet"/>
+      <w:lvlText w:val=""/>
+      <w:lvlJc w:val="left"/>
+      <w:pPr>
+        <w:tabs>
+          <w:tab w:val="left" w:pos="5040"/>
+        </w:tabs>
+        <w:ind w:left="5040" w:hanging="360"/>
+      </w:pPr>
+      <w:rPr>
+        <w:rFonts w:hint="default" w:ascii="Wingdings" w:hAnsi="Wingdings" w:cs="Wingdings"/>
+        <w:sz w:val="20"/>
+      </w:rPr>
+    </w:lvl>
+    <w:lvl w:ilvl="7" w:tentative="0">
+      <w:start w:val="1"/>
+      <w:numFmt w:val="bullet"/>
+      <w:lvlText w:val=""/>
+      <w:lvlJc w:val="left"/>
+      <w:pPr>
+        <w:tabs>
+          <w:tab w:val="left" w:pos="5760"/>
+        </w:tabs>
+        <w:ind w:left="5760" w:hanging="360"/>
+      </w:pPr>
+      <w:rPr>
+        <w:rFonts w:hint="default" w:ascii="Wingdings" w:hAnsi="Wingdings" w:cs="Wingdings"/>
+        <w:sz w:val="20"/>
+      </w:rPr>
+    </w:lvl>
+    <w:lvl w:ilvl="8" w:tentative="0">
+      <w:start w:val="1"/>
+      <w:numFmt w:val="bullet"/>
+      <w:lvlText w:val=""/>
+      <w:lvlJc w:val="left"/>
+      <w:pPr>
+        <w:tabs>
+          <w:tab w:val="left" w:pos="6480"/>
+        </w:tabs>
+        <w:ind w:left="6480" w:hanging="360"/>
+      </w:pPr>
+      <w:rPr>
+        <w:rFonts w:hint="default" w:ascii="Wingdings" w:hAnsi="Wingdings" w:cs="Wingdings"/>
+        <w:sz w:val="20"/>
+      </w:rPr>
+    </w:lvl>
+  </w:abstractNum>
+  <w:abstractNum w:abstractNumId="2">
+    <w:nsid w:val="254E43BC"/>
+    <w:multiLevelType w:val="multilevel"/>
+    <w:tmpl w:val="254E43BC"/>
+    <w:lvl w:ilvl="0" w:tentative="0">
+      <w:start w:val="1"/>
+      <w:numFmt w:val="bullet"/>
+      <w:lvlText w:val=""/>
+      <w:lvlJc w:val="left"/>
+      <w:pPr>
+        <w:tabs>
+          <w:tab w:val="left" w:pos="720"/>
+        </w:tabs>
+        <w:ind w:left="720" w:hanging="360"/>
+      </w:pPr>
+      <w:rPr>
+        <w:rFonts w:ascii="Symbol" w:hAnsi="Symbol" w:cs="Symbol"/>
+        <w:sz w:val="20"/>
+      </w:rPr>
+    </w:lvl>
+    <w:lvl w:ilvl="1" w:tentative="0">
+      <w:start w:val="1"/>
+      <w:numFmt w:val="bullet"/>
+      <w:lvlText w:val="o"/>
+      <w:lvlJc w:val="left"/>
+      <w:pPr>
+        <w:tabs>
+          <w:tab w:val="left" w:pos="1440"/>
+        </w:tabs>
+        <w:ind w:left="1440" w:hanging="360"/>
+      </w:pPr>
+      <w:rPr>
+        <w:rFonts w:ascii="Courier New" w:hAnsi="Courier New" w:cs="Courier New"/>
+        <w:sz w:val="20"/>
+      </w:rPr>
+    </w:lvl>
+    <w:lvl w:ilvl="2" w:tentative="0">
+      <w:start w:val="1"/>
+      <w:numFmt w:val="bullet"/>
+      <w:lvlText w:val=""/>
+      <w:lvlJc w:val="left"/>
+      <w:pPr>
+        <w:tabs>
+          <w:tab w:val="left" w:pos="2160"/>
+        </w:tabs>
+        <w:ind w:left="2160" w:hanging="360"/>
+      </w:pPr>
+      <w:rPr>
+        <w:rFonts w:ascii="Wingdings" w:hAnsi="Wingdings" w:cs="Wingdings"/>
+        <w:sz w:val="20"/>
+      </w:rPr>
+    </w:lvl>
+    <w:lvl w:ilvl="3" w:tentative="0">
+      <w:start w:val="1"/>
+      <w:numFmt w:val="bullet"/>
+      <w:lvlText w:val=""/>
+      <w:lvlJc w:val="left"/>
+      <w:pPr>
+        <w:tabs>
+          <w:tab w:val="left" w:pos="2880"/>
+        </w:tabs>
+        <w:ind w:left="2880" w:hanging="360"/>
+      </w:pPr>
+      <w:rPr>
+        <w:rFonts w:hint="default" w:ascii="Wingdings" w:hAnsi="Wingdings" w:cs="Wingdings"/>
+        <w:sz w:val="20"/>
+      </w:rPr>
+    </w:lvl>
+    <w:lvl w:ilvl="4" w:tentative="0">
+      <w:start w:val="1"/>
+      <w:numFmt w:val="bullet"/>
+      <w:lvlText w:val=""/>
+      <w:lvlJc w:val="left"/>
+      <w:pPr>
+        <w:tabs>
+          <w:tab w:val="left" w:pos="3600"/>
+        </w:tabs>
+        <w:ind w:left="3600" w:hanging="360"/>
+      </w:pPr>
+      <w:rPr>
+        <w:rFonts w:hint="default" w:ascii="Wingdings" w:hAnsi="Wingdings" w:cs="Wingdings"/>
+        <w:sz w:val="20"/>
+      </w:rPr>
+    </w:lvl>
+    <w:lvl w:ilvl="5" w:tentative="0">
+      <w:start w:val="1"/>
+      <w:numFmt w:val="bullet"/>
+      <w:lvlText w:val=""/>
+      <w:lvlJc w:val="left"/>
+      <w:pPr>
+        <w:tabs>
+          <w:tab w:val="left" w:pos="4320"/>
+        </w:tabs>
+        <w:ind w:left="4320" w:hanging="360"/>
+      </w:pPr>
+      <w:rPr>
+        <w:rFonts w:hint="default" w:ascii="Wingdings" w:hAnsi="Wingdings" w:cs="Wingdings"/>
+        <w:sz w:val="20"/>
+      </w:rPr>
+    </w:lvl>
+    <w:lvl w:ilvl="6" w:tentative="0">
+      <w:start w:val="1"/>
+      <w:numFmt w:val="bullet"/>
+      <w:lvlText w:val=""/>
+      <w:lvlJc w:val="left"/>
+      <w:pPr>
+        <w:tabs>
+          <w:tab w:val="left" w:pos="5040"/>
+        </w:tabs>
+        <w:ind w:left="5040" w:hanging="360"/>
+      </w:pPr>
+      <w:rPr>
+        <w:rFonts w:hint="default" w:ascii="Wingdings" w:hAnsi="Wingdings" w:cs="Wingdings"/>
+        <w:sz w:val="20"/>
+      </w:rPr>
+    </w:lvl>
+    <w:lvl w:ilvl="7" w:tentative="0">
+      <w:start w:val="1"/>
+      <w:numFmt w:val="bullet"/>
+      <w:lvlText w:val=""/>
+      <w:lvlJc w:val="left"/>
+      <w:pPr>
+        <w:tabs>
+          <w:tab w:val="left" w:pos="5760"/>
+        </w:tabs>
+        <w:ind w:left="5760" w:hanging="360"/>
+      </w:pPr>
+      <w:rPr>
+        <w:rFonts w:hint="default" w:ascii="Wingdings" w:hAnsi="Wingdings" w:cs="Wingdings"/>
+        <w:sz w:val="20"/>
+      </w:rPr>
+    </w:lvl>
+    <w:lvl w:ilvl="8" w:tentative="0">
+      <w:start w:val="1"/>
+      <w:numFmt w:val="bullet"/>
+      <w:lvlText w:val=""/>
+      <w:lvlJc w:val="left"/>
+      <w:pPr>
+        <w:tabs>
+          <w:tab w:val="left" w:pos="6480"/>
+        </w:tabs>
+        <w:ind w:left="6480" w:hanging="360"/>
+      </w:pPr>
+      <w:rPr>
+        <w:rFonts w:hint="default" w:ascii="Wingdings" w:hAnsi="Wingdings" w:cs="Wingdings"/>
+        <w:sz w:val="20"/>
+      </w:rPr>
+    </w:lvl>
+  </w:abstractNum>
+  <w:abstractNum w:abstractNumId="3">
+    <w:nsid w:val="4663874D"/>
+    <w:multiLevelType w:val="multilevel"/>
+    <w:tmpl w:val="4663874D"/>
+    <w:lvl w:ilvl="0" w:tentative="0">
+      <w:start w:val="1"/>
+      <w:numFmt w:val="bullet"/>
+      <w:lvlText w:val=""/>
+      <w:lvlJc w:val="left"/>
+      <w:pPr>
+        <w:tabs>
+          <w:tab w:val="left" w:pos="720"/>
+        </w:tabs>
+        <w:ind w:left="720" w:hanging="360"/>
+      </w:pPr>
+      <w:rPr>
+        <w:rFonts w:hint="default" w:ascii="Symbol" w:hAnsi="Symbol" w:cs="Symbol"/>
+        <w:sz w:val="20"/>
+      </w:rPr>
+    </w:lvl>
+    <w:lvl w:ilvl="1" w:tentative="0">
+      <w:start w:val="1"/>
+      <w:numFmt w:val="bullet"/>
+      <w:lvlText w:val="o"/>
+      <w:lvlJc w:val="left"/>
+      <w:pPr>
+        <w:tabs>
+          <w:tab w:val="left" w:pos="1440"/>
+        </w:tabs>
+        <w:ind w:left="1440" w:hanging="360"/>
+      </w:pPr>
+      <w:rPr>
+        <w:rFonts w:hint="default" w:ascii="Courier New" w:hAnsi="Courier New" w:cs="Courier New"/>
+        <w:sz w:val="20"/>
+      </w:rPr>
+    </w:lvl>
+    <w:lvl w:ilvl="2" w:tentative="0">
+      <w:start w:val="1"/>
+      <w:numFmt w:val="bullet"/>
+      <w:lvlText w:val=""/>
+      <w:lvlJc w:val="left"/>
+      <w:pPr>
+        <w:tabs>
+          <w:tab w:val="left" w:pos="2160"/>
+        </w:tabs>
+        <w:ind w:left="2160" w:hanging="360"/>
+      </w:pPr>
+      <w:rPr>
+        <w:rFonts w:hint="default" w:ascii="Wingdings" w:hAnsi="Wingdings" w:cs="Wingdings"/>
+        <w:sz w:val="20"/>
+      </w:rPr>
+    </w:lvl>
+    <w:lvl w:ilvl="3" w:tentative="0">
+      <w:start w:val="1"/>
+      <w:numFmt w:val="bullet"/>
+      <w:lvlText w:val=""/>
+      <w:lvlJc w:val="left"/>
+      <w:pPr>
+        <w:tabs>
+          <w:tab w:val="left" w:pos="2880"/>
+        </w:tabs>
+        <w:ind w:left="2880" w:hanging="360"/>
+      </w:pPr>
+      <w:rPr>
+        <w:rFonts w:hint="default" w:ascii="Wingdings" w:hAnsi="Wingdings" w:cs="Wingdings"/>
+        <w:sz w:val="20"/>
+      </w:rPr>
+    </w:lvl>
+    <w:lvl w:ilvl="4" w:tentative="0">
+      <w:start w:val="1"/>
+      <w:numFmt w:val="bullet"/>
+      <w:lvlText w:val=""/>
+      <w:lvlJc w:val="left"/>
+      <w:pPr>
+        <w:tabs>
+          <w:tab w:val="left" w:pos="3600"/>
+        </w:tabs>
+        <w:ind w:left="3600" w:hanging="360"/>
+      </w:pPr>
+      <w:rPr>
+        <w:rFonts w:hint="default" w:ascii="Wingdings" w:hAnsi="Wingdings" w:cs="Wingdings"/>
+        <w:sz w:val="20"/>
+      </w:rPr>
+    </w:lvl>
+    <w:lvl w:ilvl="5" w:tentative="0">
+      <w:start w:val="1"/>
+      <w:numFmt w:val="bullet"/>
+      <w:lvlText w:val=""/>
+      <w:lvlJc w:val="left"/>
+      <w:pPr>
+        <w:tabs>
+          <w:tab w:val="left" w:pos="4320"/>
+        </w:tabs>
+        <w:ind w:left="4320" w:hanging="360"/>
+      </w:pPr>
+      <w:rPr>
+        <w:rFonts w:hint="default" w:ascii="Wingdings" w:hAnsi="Wingdings" w:cs="Wingdings"/>
+        <w:sz w:val="20"/>
+      </w:rPr>
+    </w:lvl>
+    <w:lvl w:ilvl="6" w:tentative="0">
+      <w:start w:val="1"/>
+      <w:numFmt w:val="bullet"/>
+      <w:lvlText w:val=""/>
+      <w:lvlJc w:val="left"/>
+      <w:pPr>
+        <w:tabs>
+          <w:tab w:val="left" w:pos="5040"/>
+        </w:tabs>
+        <w:ind w:left="5040" w:hanging="360"/>
+      </w:pPr>
+      <w:rPr>
+        <w:rFonts w:hint="default" w:ascii="Wingdings" w:hAnsi="Wingdings" w:cs="Wingdings"/>
+        <w:sz w:val="20"/>
+      </w:rPr>
+    </w:lvl>
+    <w:lvl w:ilvl="7" w:tentative="0">
+      <w:start w:val="1"/>
+      <w:numFmt w:val="bullet"/>
+      <w:lvlText w:val=""/>
+      <w:lvlJc w:val="left"/>
+      <w:pPr>
+        <w:tabs>
+          <w:tab w:val="left" w:pos="5760"/>
+        </w:tabs>
+        <w:ind w:left="5760" w:hanging="360"/>
+      </w:pPr>
+      <w:rPr>
+        <w:rFonts w:hint="default" w:ascii="Wingdings" w:hAnsi="Wingdings" w:cs="Wingdings"/>
+        <w:sz w:val="20"/>
+      </w:rPr>
+    </w:lvl>
+    <w:lvl w:ilvl="8" w:tentative="0">
+      <w:start w:val="1"/>
+      <w:numFmt w:val="bullet"/>
+      <w:lvlText w:val=""/>
+      <w:lvlJc w:val="left"/>
+      <w:pPr>
+        <w:tabs>
+          <w:tab w:val="left" w:pos="6480"/>
+        </w:tabs>
+        <w:ind w:left="6480" w:hanging="360"/>
+      </w:pPr>
+      <w:rPr>
+        <w:rFonts w:hint="default" w:ascii="Wingdings" w:hAnsi="Wingdings" w:cs="Wingdings"/>
+        <w:sz w:val="20"/>
+      </w:rPr>
+    </w:lvl>
+  </w:abstractNum>
+  <w:abstractNum w:abstractNumId="4">
+    <w:nsid w:val="5113EBB9"/>
+    <w:multiLevelType w:val="multilevel"/>
+    <w:tmpl w:val="5113EBB9"/>
+    <w:lvl w:ilvl="0" w:tentative="0">
+      <w:start w:val="1"/>
+      <w:numFmt w:val="bullet"/>
+      <w:lvlText w:val=""/>
+      <w:lvlJc w:val="left"/>
+      <w:pPr>
+        <w:tabs>
+          <w:tab w:val="left" w:pos="720"/>
+        </w:tabs>
+        <w:ind w:left="720" w:hanging="360"/>
+      </w:pPr>
+      <w:rPr>
+        <w:rFonts w:hint="default" w:ascii="Symbol" w:hAnsi="Symbol" w:cs="Symbol"/>
+        <w:sz w:val="20"/>
+      </w:rPr>
+    </w:lvl>
+    <w:lvl w:ilvl="1" w:tentative="0">
+      <w:start w:val="1"/>
+      <w:numFmt w:val="bullet"/>
+      <w:lvlText w:val="o"/>
+      <w:lvlJc w:val="left"/>
+      <w:pPr>
+        <w:tabs>
+          <w:tab w:val="left" w:pos="1440"/>
+        </w:tabs>
+        <w:ind w:left="1440" w:hanging="360"/>
+      </w:pPr>
+      <w:rPr>
+        <w:rFonts w:hint="default" w:ascii="Courier New" w:hAnsi="Courier New" w:cs="Courier New"/>
+        <w:sz w:val="20"/>
+      </w:rPr>
+    </w:lvl>
+    <w:lvl w:ilvl="2" w:tentative="0">
+      <w:start w:val="1"/>
+      <w:numFmt w:val="bullet"/>
+      <w:lvlText w:val=""/>
+      <w:lvlJc w:val="left"/>
+      <w:pPr>
+        <w:tabs>
+          <w:tab w:val="left" w:pos="2160"/>
+        </w:tabs>
+        <w:ind w:left="2160" w:hanging="360"/>
+      </w:pPr>
+      <w:rPr>
+        <w:rFonts w:hint="default" w:ascii="Wingdings" w:hAnsi="Wingdings" w:cs="Wingdings"/>
+        <w:sz w:val="20"/>
+      </w:rPr>
+    </w:lvl>
+    <w:lvl w:ilvl="3" w:tentative="0">
+      <w:start w:val="1"/>
+      <w:numFmt w:val="bullet"/>
+      <w:lvlText w:val=""/>
+      <w:lvlJc w:val="left"/>
+      <w:pPr>
+        <w:tabs>
+          <w:tab w:val="left" w:pos="2880"/>
+        </w:tabs>
+        <w:ind w:left="2880" w:hanging="360"/>
+      </w:pPr>
+      <w:rPr>
+        <w:rFonts w:hint="default" w:ascii="Wingdings" w:hAnsi="Wingdings" w:cs="Wingdings"/>
+        <w:sz w:val="20"/>
+      </w:rPr>
+    </w:lvl>
+    <w:lvl w:ilvl="4" w:tentative="0">
+      <w:start w:val="1"/>
+      <w:numFmt w:val="bullet"/>
+      <w:lvlText w:val=""/>
+      <w:lvlJc w:val="left"/>
+      <w:pPr>
+        <w:tabs>
+          <w:tab w:val="left" w:pos="3600"/>
+        </w:tabs>
+        <w:ind w:left="3600" w:hanging="360"/>
+      </w:pPr>
+      <w:rPr>
+        <w:rFonts w:hint="default" w:ascii="Wingdings" w:hAnsi="Wingdings" w:cs="Wingdings"/>
+        <w:sz w:val="20"/>
+      </w:rPr>
+    </w:lvl>
+    <w:lvl w:ilvl="5" w:tentative="0">
+      <w:start w:val="1"/>
+      <w:numFmt w:val="bullet"/>
+      <w:lvlText w:val=""/>
+      <w:lvlJc w:val="left"/>
+      <w:pPr>
+        <w:tabs>
+          <w:tab w:val="left" w:pos="4320"/>
+        </w:tabs>
+        <w:ind w:left="4320" w:hanging="360"/>
+      </w:pPr>
+      <w:rPr>
+        <w:rFonts w:hint="default" w:ascii="Wingdings" w:hAnsi="Wingdings" w:cs="Wingdings"/>
+        <w:sz w:val="20"/>
+      </w:rPr>
+    </w:lvl>
+    <w:lvl w:ilvl="6" w:tentative="0">
+      <w:start w:val="1"/>
+      <w:numFmt w:val="bullet"/>
+      <w:lvlText w:val=""/>
+      <w:lvlJc w:val="left"/>
+      <w:pPr>
+        <w:tabs>
+          <w:tab w:val="left" w:pos="5040"/>
+        </w:tabs>
+        <w:ind w:left="5040" w:hanging="360"/>
+      </w:pPr>
+      <w:rPr>
+        <w:rFonts w:hint="default" w:ascii="Wingdings" w:hAnsi="Wingdings" w:cs="Wingdings"/>
+        <w:sz w:val="20"/>
+      </w:rPr>
+    </w:lvl>
+    <w:lvl w:ilvl="7" w:tentative="0">
+      <w:start w:val="1"/>
+      <w:numFmt w:val="bullet"/>
+      <w:lvlText w:val=""/>
+      <w:lvlJc w:val="left"/>
+      <w:pPr>
+        <w:tabs>
+          <w:tab w:val="left" w:pos="5760"/>
+        </w:tabs>
+        <w:ind w:left="5760" w:hanging="360"/>
+      </w:pPr>
+      <w:rPr>
+        <w:rFonts w:hint="default" w:ascii="Wingdings" w:hAnsi="Wingdings" w:cs="Wingdings"/>
+        <w:sz w:val="20"/>
+      </w:rPr>
+    </w:lvl>
+    <w:lvl w:ilvl="8" w:tentative="0">
+      <w:start w:val="1"/>
+      <w:numFmt w:val="bullet"/>
+      <w:lvlText w:val=""/>
+      <w:lvlJc w:val="left"/>
+      <w:pPr>
+        <w:tabs>
+          <w:tab w:val="left" w:pos="6480"/>
+        </w:tabs>
+        <w:ind w:left="6480" w:hanging="360"/>
+      </w:pPr>
+      <w:rPr>
+        <w:rFonts w:hint="default" w:ascii="Wingdings" w:hAnsi="Wingdings" w:cs="Wingdings"/>
+        <w:sz w:val="20"/>
+      </w:rPr>
+    </w:lvl>
+  </w:abstractNum>
+  <w:num w:numId="1">
+    <w:abstractNumId w:val="2"/>
+  </w:num>
+  <w:num w:numId="2">
+    <w:abstractNumId w:val="1"/>
+  </w:num>
+  <w:num w:numId="3">
+    <w:abstractNumId w:val="0"/>
+  </w:num>
+  <w:num w:numId="4">
+    <w:abstractNumId w:val="4"/>
+  </w:num>
+  <w:num w:numId="5">
+    <w:abstractNumId w:val="3"/>
+  </w:num>
+</w:numbering>
 </file>
 
 <file path=word/styles.xml><?xml version="1.0" encoding="utf-8"?>
@@ -1444,8 +3861,8 @@
     <w:lsdException w:unhideWhenUsed="0" w:uiPriority="0" w:semiHidden="0" w:name="Normal Indent"/>
     <w:lsdException w:unhideWhenUsed="0" w:uiPriority="0" w:semiHidden="0" w:name="footnote text"/>
     <w:lsdException w:unhideWhenUsed="0" w:uiPriority="0" w:semiHidden="0" w:name="annotation text"/>
-    <w:lsdException w:unhideWhenUsed="0" w:uiPriority="0" w:semiHidden="0" w:name="header"/>
-    <w:lsdException w:unhideWhenUsed="0" w:uiPriority="0" w:semiHidden="0" w:name="footer"/>
+    <w:lsdException w:qFormat="1" w:unhideWhenUsed="0" w:uiPriority="0" w:semiHidden="0" w:name="header"/>
+    <w:lsdException w:qFormat="1" w:unhideWhenUsed="0" w:uiPriority="0" w:semiHidden="0" w:name="footer"/>
     <w:lsdException w:unhideWhenUsed="0" w:uiPriority="0" w:semiHidden="0" w:name="index heading"/>
     <w:lsdException w:qFormat="1" w:uiPriority="0" w:name="caption"/>
     <w:lsdException w:unhideWhenUsed="0" w:uiPriority="0" w:semiHidden="0" w:name="table of figures"/>
@@ -1478,7 +3895,7 @@
     <w:lsdException w:qFormat="1" w:unhideWhenUsed="0" w:uiPriority="0" w:semiHidden="0" w:name="Title"/>
     <w:lsdException w:unhideWhenUsed="0" w:uiPriority="0" w:semiHidden="0" w:name="Closing"/>
     <w:lsdException w:unhideWhenUsed="0" w:uiPriority="0" w:semiHidden="0" w:name="Signature"/>
-    <w:lsdException w:unhideWhenUsed="0" w:uiPriority="0" w:name="Default Paragraph Font"/>
+    <w:lsdException w:qFormat="1" w:unhideWhenUsed="0" w:uiPriority="0" w:name="Default Paragraph Font"/>
     <w:lsdException w:unhideWhenUsed="0" w:uiPriority="0" w:semiHidden="0" w:name="Body Text"/>
     <w:lsdException w:unhideWhenUsed="0" w:uiPriority="0" w:semiHidden="0" w:name="Body Text Indent"/>
     <w:lsdException w:unhideWhenUsed="0" w:uiPriority="0" w:semiHidden="0" w:name="List Continue"/>
@@ -1505,7 +3922,9 @@
     <w:lsdException w:unhideWhenUsed="0" w:uiPriority="0" w:semiHidden="0" w:name="Document Map"/>
     <w:lsdException w:unhideWhenUsed="0" w:uiPriority="0" w:semiHidden="0" w:name="Plain Text"/>
     <w:lsdException w:unhideWhenUsed="0" w:uiPriority="0" w:semiHidden="0" w:name="E-mail Signature"/>
-    <w:lsdException w:unhideWhenUsed="0" w:uiPriority="0" w:semiHidden="0" w:name="Normal (Web)"/>
+    <w:lsdException w:unhideWhenUsed="0" w:uiPriority="0" w:semiHidden="0" w:name=""/>
+    <w:lsdException w:unhideWhenUsed="0" w:uiPriority="0" w:semiHidden="0" w:name=""/>
+    <w:lsdException w:qFormat="1" w:unhideWhenUsed="0" w:uiPriority="0" w:semiHidden="0" w:name="Normal (Web)"/>
     <w:lsdException w:unhideWhenUsed="0" w:uiPriority="0" w:semiHidden="0" w:name="HTML Acronym"/>
     <w:lsdException w:unhideWhenUsed="0" w:uiPriority="0" w:semiHidden="0" w:name="HTML Address"/>
     <w:lsdException w:unhideWhenUsed="0" w:uiPriority="0" w:semiHidden="0" w:name="HTML Cite"/>
@@ -1735,6 +4154,7 @@
   <w:style w:type="character" w:default="1" w:styleId="5">
     <w:name w:val="Default Paragraph Font"/>
     <w:semiHidden/>
+    <w:qFormat/>
     <w:uiPriority w:val="0"/>
   </w:style>
   <w:style w:type="table" w:default="1" w:styleId="6">
@@ -1754,6 +4174,7 @@
   <w:style w:type="paragraph" w:styleId="7">
     <w:name w:val="footer"/>
     <w:basedOn w:val="1"/>
+    <w:qFormat/>
     <w:uiPriority w:val="0"/>
     <w:pPr>
       <w:tabs>
@@ -1771,6 +4192,7 @@
   <w:style w:type="paragraph" w:styleId="8">
     <w:name w:val="header"/>
     <w:basedOn w:val="1"/>
+    <w:qFormat/>
     <w:uiPriority w:val="0"/>
     <w:pPr>
       <w:tabs>
@@ -1786,6 +4208,7 @@
   </w:style>
   <w:style w:type="paragraph" w:styleId="9">
     <w:name w:val="Normal (Web)"/>
+    <w:qFormat/>
     <w:uiPriority w:val="0"/>
     <w:pPr>
       <w:spacing w:before="0" w:beforeAutospacing="1" w:after="0" w:afterAutospacing="1"/>
@@ -1793,6 +4216,7 @@
       <w:jc w:val="left"/>
     </w:pPr>
     <w:rPr>
+      <w:rFonts w:ascii="Times New Roman" w:hAnsi="Times New Roman" w:eastAsia="SimSun" w:cs="Times New Roman"/>
       <w:kern w:val="0"/>
       <w:sz w:val="24"/>
       <w:szCs w:val="24"/>
@@ -1807,6 +4231,40 @@
     <w:rPr>
       <w:b/>
       <w:bCs/>
+    </w:rPr>
+  </w:style>
+  <w:style w:type="paragraph" w:styleId="11">
+    <w:name w:val=""/>
+    <w:basedOn w:val="1"/>
+    <w:next w:val="1"/>
+    <w:uiPriority w:val="0"/>
+    <w:pPr>
+      <w:pBdr>
+        <w:bottom w:val="single" w:color="auto" w:sz="6" w:space="1"/>
+      </w:pBdr>
+      <w:jc w:val="center"/>
+    </w:pPr>
+    <w:rPr>
+      <w:rFonts w:ascii="Arial" w:eastAsia="SimSun"/>
+      <w:vanish/>
+      <w:sz w:val="16"/>
+    </w:rPr>
+  </w:style>
+  <w:style w:type="paragraph" w:styleId="12">
+    <w:name w:val=""/>
+    <w:basedOn w:val="1"/>
+    <w:next w:val="1"/>
+    <w:uiPriority w:val="0"/>
+    <w:pPr>
+      <w:pBdr>
+        <w:top w:val="single" w:color="auto" w:sz="6" w:space="1"/>
+      </w:pBdr>
+      <w:jc w:val="center"/>
+    </w:pPr>
+    <w:rPr>
+      <w:rFonts w:ascii="Arial" w:eastAsia="SimSun"/>
+      <w:vanish/>
+      <w:sz w:val="16"/>
     </w:rPr>
   </w:style>
 </w:styles>

</xml_diff>